<commit_message>
docs: comments added to Generated code document
remaining comments added to generated code
</commit_message>
<xml_diff>
--- a/Documentation/Generated code with comments.docx
+++ b/Documentation/Generated code with comments.docx
@@ -20,43 +20,7 @@
           <w:sz w:val="22"/>
           <w:szCs w:val="22"/>
         </w:rPr>
-        <w:t xml:space="preserve">public class </w:t>
-      </w:r>
-      <w:proofErr w:type="spellStart"/>
-      <w:r>
-        <w:rPr>
-          <w:rFonts w:ascii="Calibri" w:hAnsi="Calibri" w:cs="Calibri"/>
-          <w:sz w:val="22"/>
-          <w:szCs w:val="22"/>
-        </w:rPr>
-        <w:t>IPOS_PU_API</w:t>
-      </w:r>
-      <w:proofErr w:type="spellEnd"/>
-      <w:r>
-        <w:rPr>
-          <w:rFonts w:ascii="Calibri" w:hAnsi="Calibri" w:cs="Calibri"/>
-          <w:sz w:val="22"/>
-          <w:szCs w:val="22"/>
-        </w:rPr>
-        <w:t xml:space="preserve"> implements </w:t>
-      </w:r>
-      <w:proofErr w:type="spellStart"/>
-      <w:r>
-        <w:rPr>
-          <w:rFonts w:ascii="Calibri" w:hAnsi="Calibri" w:cs="Calibri"/>
-          <w:sz w:val="22"/>
-          <w:szCs w:val="22"/>
-        </w:rPr>
-        <w:t>I_IPOS_PU</w:t>
-      </w:r>
-      <w:proofErr w:type="spellEnd"/>
-      <w:r>
-        <w:rPr>
-          <w:rFonts w:ascii="Calibri" w:hAnsi="Calibri" w:cs="Calibri"/>
-          <w:sz w:val="22"/>
-          <w:szCs w:val="22"/>
-        </w:rPr>
-        <w:t xml:space="preserve"> {</w:t>
+        <w:t>public class IPOS_PU_API implements I_IPOS_PU {</w:t>
       </w:r>
       <w:r>
         <w:rPr>
@@ -794,25 +758,7 @@
           <w:szCs w:val="22"/>
         </w:rPr>
         <w:br/>
-        <w:t xml:space="preserve">public </w:t>
-      </w:r>
-      <w:proofErr w:type="spellStart"/>
-      <w:r>
-        <w:rPr>
-          <w:rFonts w:ascii="Calibri" w:hAnsi="Calibri" w:cs="Calibri"/>
-          <w:sz w:val="22"/>
-          <w:szCs w:val="22"/>
-        </w:rPr>
-        <w:t>IPOS_PU_API</w:t>
-      </w:r>
-      <w:proofErr w:type="spellEnd"/>
-      <w:r>
-        <w:rPr>
-          <w:rFonts w:ascii="Calibri" w:hAnsi="Calibri" w:cs="Calibri"/>
-          <w:sz w:val="22"/>
-          <w:szCs w:val="22"/>
-        </w:rPr>
-        <w:t>() {</w:t>
+        <w:t>public IPOS_PU_API() {</w:t>
       </w:r>
       <w:r>
         <w:rPr>
@@ -1761,14 +1707,6 @@
           <w:szCs w:val="22"/>
         </w:rPr>
       </w:pPr>
-      <w:r>
-        <w:rPr>
-          <w:rFonts w:ascii="Calibri" w:hAnsi="Calibri" w:cs="Calibri"/>
-          <w:sz w:val="22"/>
-          <w:szCs w:val="22"/>
-        </w:rPr>
-        <w:t>public interface I_IPOS_SA_ProductCatalogue {</w:t>
-      </w:r>
     </w:p>
     <w:p>
       <w:pPr>
@@ -1796,580 +1734,1225 @@
           <w:szCs w:val="22"/>
         </w:rPr>
         <w:lastRenderedPageBreak/>
-        <w:t xml:space="preserve">    /**</w:t>
-      </w:r>
-    </w:p>
-    <w:p>
-      <w:pPr>
-        <w:spacing w:after="0"/>
-        <w:rPr>
-          <w:rFonts w:ascii="Calibri" w:hAnsi="Calibri" w:cs="Calibri"/>
-          <w:sz w:val="22"/>
-          <w:szCs w:val="22"/>
-        </w:rPr>
-      </w:pPr>
-      <w:r>
-        <w:rPr>
-          <w:rFonts w:ascii="Calibri" w:hAnsi="Calibri" w:cs="Calibri"/>
-          <w:sz w:val="22"/>
-          <w:szCs w:val="22"/>
-        </w:rPr>
-        <w:t xml:space="preserve">     * </w:t>
-      </w:r>
-    </w:p>
-    <w:p>
-      <w:pPr>
-        <w:spacing w:after="0"/>
-        <w:rPr>
-          <w:rFonts w:ascii="Calibri" w:hAnsi="Calibri" w:cs="Calibri"/>
-          <w:sz w:val="22"/>
-          <w:szCs w:val="22"/>
-        </w:rPr>
-      </w:pPr>
-      <w:r>
-        <w:rPr>
-          <w:rFonts w:ascii="Calibri" w:hAnsi="Calibri" w:cs="Calibri"/>
-          <w:sz w:val="22"/>
-          <w:szCs w:val="22"/>
-        </w:rPr>
-        <w:t xml:space="preserve">     * @param productID</w:t>
-      </w:r>
-    </w:p>
-    <w:p>
-      <w:pPr>
-        <w:spacing w:after="0"/>
-        <w:rPr>
-          <w:rFonts w:ascii="Calibri" w:hAnsi="Calibri" w:cs="Calibri"/>
-          <w:sz w:val="22"/>
-          <w:szCs w:val="22"/>
-        </w:rPr>
-      </w:pPr>
-      <w:r>
-        <w:rPr>
-          <w:rFonts w:ascii="Calibri" w:hAnsi="Calibri" w:cs="Calibri"/>
-          <w:sz w:val="22"/>
-          <w:szCs w:val="22"/>
-        </w:rPr>
-        <w:t xml:space="preserve">     */</w:t>
-      </w:r>
-    </w:p>
-    <w:p>
-      <w:pPr>
-        <w:spacing w:after="0"/>
-        <w:rPr>
-          <w:rFonts w:ascii="Calibri" w:hAnsi="Calibri" w:cs="Calibri"/>
-          <w:sz w:val="22"/>
-          <w:szCs w:val="22"/>
-        </w:rPr>
-      </w:pPr>
-      <w:r>
-        <w:rPr>
-          <w:rFonts w:ascii="Calibri" w:hAnsi="Calibri" w:cs="Calibri"/>
-          <w:sz w:val="22"/>
-          <w:szCs w:val="22"/>
-        </w:rPr>
-        <w:t xml:space="preserve">    public Product getProduct(String productID);</w:t>
-      </w:r>
-    </w:p>
-    <w:p>
-      <w:pPr>
-        <w:spacing w:after="0"/>
-        <w:rPr>
-          <w:rFonts w:ascii="Calibri" w:hAnsi="Calibri" w:cs="Calibri"/>
-          <w:sz w:val="22"/>
-          <w:szCs w:val="22"/>
-        </w:rPr>
-      </w:pPr>
-    </w:p>
-    <w:p>
-      <w:pPr>
-        <w:spacing w:after="0"/>
-        <w:rPr>
-          <w:rFonts w:ascii="Calibri" w:hAnsi="Calibri" w:cs="Calibri"/>
-          <w:sz w:val="22"/>
-          <w:szCs w:val="22"/>
-        </w:rPr>
-      </w:pPr>
-      <w:r>
-        <w:rPr>
-          <w:rFonts w:ascii="Calibri" w:hAnsi="Calibri" w:cs="Calibri"/>
-          <w:sz w:val="22"/>
-          <w:szCs w:val="22"/>
-        </w:rPr>
-        <w:t xml:space="preserve">    /**</w:t>
-      </w:r>
-    </w:p>
-    <w:p>
-      <w:pPr>
-        <w:spacing w:after="0"/>
-        <w:rPr>
-          <w:rFonts w:ascii="Calibri" w:hAnsi="Calibri" w:cs="Calibri"/>
-          <w:sz w:val="22"/>
-          <w:szCs w:val="22"/>
-        </w:rPr>
-      </w:pPr>
-      <w:r>
-        <w:rPr>
-          <w:rFonts w:ascii="Calibri" w:hAnsi="Calibri" w:cs="Calibri"/>
-          <w:sz w:val="22"/>
-          <w:szCs w:val="22"/>
-        </w:rPr>
-        <w:t xml:space="preserve">     * </w:t>
-      </w:r>
-    </w:p>
-    <w:p>
-      <w:pPr>
-        <w:spacing w:after="0"/>
-        <w:rPr>
-          <w:rFonts w:ascii="Calibri" w:hAnsi="Calibri" w:cs="Calibri"/>
-          <w:sz w:val="22"/>
-          <w:szCs w:val="22"/>
-        </w:rPr>
-      </w:pPr>
-      <w:r>
-        <w:rPr>
-          <w:rFonts w:ascii="Calibri" w:hAnsi="Calibri" w:cs="Calibri"/>
-          <w:sz w:val="22"/>
-          <w:szCs w:val="22"/>
-        </w:rPr>
-        <w:t xml:space="preserve">     */</w:t>
-      </w:r>
-    </w:p>
-    <w:p>
-      <w:pPr>
-        <w:spacing w:after="0"/>
-        <w:rPr>
-          <w:rFonts w:ascii="Calibri" w:hAnsi="Calibri" w:cs="Calibri"/>
-          <w:sz w:val="22"/>
-          <w:szCs w:val="22"/>
-        </w:rPr>
-      </w:pPr>
-      <w:r>
-        <w:rPr>
-          <w:rFonts w:ascii="Calibri" w:hAnsi="Calibri" w:cs="Calibri"/>
-          <w:sz w:val="22"/>
-          <w:szCs w:val="22"/>
-        </w:rPr>
-        <w:t xml:space="preserve">    public Product[] listProducts();</w:t>
-      </w:r>
-    </w:p>
-    <w:p>
-      <w:pPr>
-        <w:spacing w:after="0"/>
-        <w:rPr>
-          <w:rFonts w:ascii="Calibri" w:hAnsi="Calibri" w:cs="Calibri"/>
-          <w:sz w:val="22"/>
-          <w:szCs w:val="22"/>
-        </w:rPr>
-      </w:pPr>
-    </w:p>
-    <w:p>
-      <w:pPr>
-        <w:spacing w:after="0"/>
-        <w:rPr>
-          <w:rFonts w:ascii="Calibri" w:hAnsi="Calibri" w:cs="Calibri"/>
-          <w:sz w:val="22"/>
-          <w:szCs w:val="22"/>
-        </w:rPr>
-      </w:pPr>
-      <w:r>
-        <w:rPr>
-          <w:rFonts w:ascii="Calibri" w:hAnsi="Calibri" w:cs="Calibri"/>
-          <w:sz w:val="22"/>
-          <w:szCs w:val="22"/>
-        </w:rPr>
-        <w:t xml:space="preserve">    /**</w:t>
-      </w:r>
-    </w:p>
-    <w:p>
-      <w:pPr>
-        <w:spacing w:after="0"/>
-        <w:rPr>
-          <w:rFonts w:ascii="Calibri" w:hAnsi="Calibri" w:cs="Calibri"/>
-          <w:sz w:val="22"/>
-          <w:szCs w:val="22"/>
-        </w:rPr>
-      </w:pPr>
-      <w:r>
-        <w:rPr>
-          <w:rFonts w:ascii="Calibri" w:hAnsi="Calibri" w:cs="Calibri"/>
-          <w:sz w:val="22"/>
-          <w:szCs w:val="22"/>
-        </w:rPr>
-        <w:t xml:space="preserve">     * </w:t>
-      </w:r>
-    </w:p>
-    <w:p>
-      <w:pPr>
-        <w:spacing w:after="0"/>
-        <w:rPr>
-          <w:rFonts w:ascii="Calibri" w:hAnsi="Calibri" w:cs="Calibri"/>
-          <w:sz w:val="22"/>
-          <w:szCs w:val="22"/>
-        </w:rPr>
-      </w:pPr>
-      <w:r>
-        <w:rPr>
-          <w:rFonts w:ascii="Calibri" w:hAnsi="Calibri" w:cs="Calibri"/>
-          <w:sz w:val="22"/>
-          <w:szCs w:val="22"/>
-        </w:rPr>
-        <w:t xml:space="preserve">     * @param product</w:t>
-      </w:r>
-    </w:p>
-    <w:p>
-      <w:pPr>
-        <w:spacing w:after="0"/>
-        <w:rPr>
-          <w:rFonts w:ascii="Calibri" w:hAnsi="Calibri" w:cs="Calibri"/>
-          <w:sz w:val="22"/>
-          <w:szCs w:val="22"/>
-        </w:rPr>
-      </w:pPr>
-      <w:r>
-        <w:rPr>
-          <w:rFonts w:ascii="Calibri" w:hAnsi="Calibri" w:cs="Calibri"/>
-          <w:sz w:val="22"/>
-          <w:szCs w:val="22"/>
-        </w:rPr>
-        <w:t xml:space="preserve">     */</w:t>
-      </w:r>
-    </w:p>
-    <w:p>
-      <w:pPr>
-        <w:spacing w:after="0"/>
-        <w:rPr>
-          <w:rFonts w:ascii="Calibri" w:hAnsi="Calibri" w:cs="Calibri"/>
-          <w:sz w:val="22"/>
-          <w:szCs w:val="22"/>
-        </w:rPr>
-      </w:pPr>
-      <w:r>
-        <w:rPr>
-          <w:rFonts w:ascii="Calibri" w:hAnsi="Calibri" w:cs="Calibri"/>
-          <w:sz w:val="22"/>
-          <w:szCs w:val="22"/>
-        </w:rPr>
-        <w:t xml:space="preserve">    public int addProduct(Product product);</w:t>
-      </w:r>
-    </w:p>
-    <w:p>
-      <w:pPr>
-        <w:spacing w:after="0"/>
-        <w:rPr>
-          <w:rFonts w:ascii="Calibri" w:hAnsi="Calibri" w:cs="Calibri"/>
-          <w:sz w:val="22"/>
-          <w:szCs w:val="22"/>
-        </w:rPr>
-      </w:pPr>
-    </w:p>
-    <w:p>
-      <w:pPr>
-        <w:spacing w:after="0"/>
-        <w:rPr>
-          <w:rFonts w:ascii="Calibri" w:hAnsi="Calibri" w:cs="Calibri"/>
-          <w:sz w:val="22"/>
-          <w:szCs w:val="22"/>
-        </w:rPr>
-      </w:pPr>
-      <w:r>
-        <w:rPr>
-          <w:rFonts w:ascii="Calibri" w:hAnsi="Calibri" w:cs="Calibri"/>
-          <w:sz w:val="22"/>
-          <w:szCs w:val="22"/>
-        </w:rPr>
-        <w:t xml:space="preserve">    /**</w:t>
-      </w:r>
-    </w:p>
-    <w:p>
-      <w:pPr>
-        <w:spacing w:after="0"/>
-        <w:rPr>
-          <w:rFonts w:ascii="Calibri" w:hAnsi="Calibri" w:cs="Calibri"/>
-          <w:sz w:val="22"/>
-          <w:szCs w:val="22"/>
-        </w:rPr>
-      </w:pPr>
-      <w:r>
-        <w:rPr>
-          <w:rFonts w:ascii="Calibri" w:hAnsi="Calibri" w:cs="Calibri"/>
-          <w:sz w:val="22"/>
-          <w:szCs w:val="22"/>
-        </w:rPr>
-        <w:t xml:space="preserve">     * </w:t>
-      </w:r>
-    </w:p>
-    <w:p>
-      <w:pPr>
-        <w:spacing w:after="0"/>
-        <w:rPr>
-          <w:rFonts w:ascii="Calibri" w:hAnsi="Calibri" w:cs="Calibri"/>
-          <w:sz w:val="22"/>
-          <w:szCs w:val="22"/>
-        </w:rPr>
-      </w:pPr>
-      <w:r>
-        <w:rPr>
-          <w:rFonts w:ascii="Calibri" w:hAnsi="Calibri" w:cs="Calibri"/>
-          <w:sz w:val="22"/>
-          <w:szCs w:val="22"/>
-        </w:rPr>
-        <w:t xml:space="preserve">     * @param productID</w:t>
-      </w:r>
-    </w:p>
-    <w:p>
-      <w:pPr>
-        <w:spacing w:after="0"/>
-        <w:rPr>
-          <w:rFonts w:ascii="Calibri" w:hAnsi="Calibri" w:cs="Calibri"/>
-          <w:sz w:val="22"/>
-          <w:szCs w:val="22"/>
-        </w:rPr>
-      </w:pPr>
-      <w:r>
-        <w:rPr>
-          <w:rFonts w:ascii="Calibri" w:hAnsi="Calibri" w:cs="Calibri"/>
-          <w:sz w:val="22"/>
-          <w:szCs w:val="22"/>
-        </w:rPr>
-        <w:t xml:space="preserve">     * @param quantity</w:t>
-      </w:r>
-    </w:p>
-    <w:p>
-      <w:pPr>
-        <w:spacing w:after="0"/>
-        <w:rPr>
-          <w:rFonts w:ascii="Calibri" w:hAnsi="Calibri" w:cs="Calibri"/>
-          <w:sz w:val="22"/>
-          <w:szCs w:val="22"/>
-        </w:rPr>
-      </w:pPr>
-      <w:r>
-        <w:rPr>
-          <w:rFonts w:ascii="Calibri" w:hAnsi="Calibri" w:cs="Calibri"/>
-          <w:sz w:val="22"/>
-          <w:szCs w:val="22"/>
-        </w:rPr>
-        <w:t xml:space="preserve">     */</w:t>
-      </w:r>
-    </w:p>
-    <w:p>
-      <w:pPr>
-        <w:spacing w:after="0"/>
-        <w:rPr>
-          <w:rFonts w:ascii="Calibri" w:hAnsi="Calibri" w:cs="Calibri"/>
-          <w:sz w:val="22"/>
-          <w:szCs w:val="22"/>
-        </w:rPr>
-      </w:pPr>
-      <w:r>
-        <w:rPr>
-          <w:rFonts w:ascii="Calibri" w:hAnsi="Calibri" w:cs="Calibri"/>
-          <w:sz w:val="22"/>
-          <w:szCs w:val="22"/>
-        </w:rPr>
-        <w:t xml:space="preserve">    public int updateStock(int productID, int quantity);</w:t>
-      </w:r>
-    </w:p>
-    <w:p>
-      <w:pPr>
-        <w:spacing w:after="0"/>
-        <w:rPr>
-          <w:rFonts w:ascii="Calibri" w:hAnsi="Calibri" w:cs="Calibri"/>
-          <w:sz w:val="22"/>
-          <w:szCs w:val="22"/>
-        </w:rPr>
-      </w:pPr>
-    </w:p>
-    <w:p>
-      <w:pPr>
-        <w:spacing w:after="0"/>
-        <w:rPr>
-          <w:rFonts w:ascii="Calibri" w:hAnsi="Calibri" w:cs="Calibri"/>
-          <w:sz w:val="22"/>
-          <w:szCs w:val="22"/>
-        </w:rPr>
-      </w:pPr>
-      <w:r>
-        <w:rPr>
-          <w:rFonts w:ascii="Calibri" w:hAnsi="Calibri" w:cs="Calibri"/>
-          <w:sz w:val="22"/>
-          <w:szCs w:val="22"/>
-        </w:rPr>
-        <w:t xml:space="preserve">    /**</w:t>
-      </w:r>
-    </w:p>
-    <w:p>
-      <w:pPr>
-        <w:spacing w:after="0"/>
-        <w:rPr>
-          <w:rFonts w:ascii="Calibri" w:hAnsi="Calibri" w:cs="Calibri"/>
-          <w:sz w:val="22"/>
-          <w:szCs w:val="22"/>
-        </w:rPr>
-      </w:pPr>
-      <w:r>
-        <w:rPr>
-          <w:rFonts w:ascii="Calibri" w:hAnsi="Calibri" w:cs="Calibri"/>
-          <w:sz w:val="22"/>
-          <w:szCs w:val="22"/>
-        </w:rPr>
-        <w:t xml:space="preserve">     * </w:t>
-      </w:r>
-    </w:p>
-    <w:p>
-      <w:pPr>
-        <w:spacing w:after="0"/>
-        <w:rPr>
-          <w:rFonts w:ascii="Calibri" w:hAnsi="Calibri" w:cs="Calibri"/>
-          <w:sz w:val="22"/>
-          <w:szCs w:val="22"/>
-        </w:rPr>
-      </w:pPr>
-      <w:r>
-        <w:rPr>
-          <w:rFonts w:ascii="Calibri" w:hAnsi="Calibri" w:cs="Calibri"/>
-          <w:sz w:val="22"/>
-          <w:szCs w:val="22"/>
-        </w:rPr>
-        <w:t xml:space="preserve">     */</w:t>
-      </w:r>
-    </w:p>
-    <w:p>
-      <w:pPr>
-        <w:spacing w:after="0"/>
-        <w:rPr>
-          <w:rFonts w:ascii="Calibri" w:hAnsi="Calibri" w:cs="Calibri"/>
-          <w:sz w:val="22"/>
-          <w:szCs w:val="22"/>
-        </w:rPr>
-      </w:pPr>
-      <w:r>
-        <w:rPr>
-          <w:rFonts w:ascii="Calibri" w:hAnsi="Calibri" w:cs="Calibri"/>
-          <w:sz w:val="22"/>
-          <w:szCs w:val="22"/>
-        </w:rPr>
-        <w:t xml:space="preserve">    public Product[] getLowStock();</w:t>
-      </w:r>
-    </w:p>
-    <w:p>
-      <w:pPr>
-        <w:spacing w:after="0"/>
-        <w:rPr>
-          <w:rFonts w:ascii="Calibri" w:hAnsi="Calibri" w:cs="Calibri"/>
-          <w:sz w:val="22"/>
-          <w:szCs w:val="22"/>
-        </w:rPr>
-      </w:pPr>
-    </w:p>
-    <w:p>
-      <w:pPr>
-        <w:spacing w:after="0"/>
-        <w:rPr>
-          <w:rFonts w:ascii="Calibri" w:hAnsi="Calibri" w:cs="Calibri"/>
-          <w:sz w:val="22"/>
-          <w:szCs w:val="22"/>
-        </w:rPr>
-      </w:pPr>
-      <w:r>
-        <w:rPr>
-          <w:rFonts w:ascii="Calibri" w:hAnsi="Calibri" w:cs="Calibri"/>
-          <w:sz w:val="22"/>
-          <w:szCs w:val="22"/>
-        </w:rPr>
-        <w:t xml:space="preserve">    /**</w:t>
-      </w:r>
-    </w:p>
-    <w:p>
-      <w:pPr>
-        <w:spacing w:after="0"/>
-        <w:rPr>
-          <w:rFonts w:ascii="Calibri" w:hAnsi="Calibri" w:cs="Calibri"/>
-          <w:sz w:val="22"/>
-          <w:szCs w:val="22"/>
-        </w:rPr>
-      </w:pPr>
-      <w:r>
-        <w:rPr>
-          <w:rFonts w:ascii="Calibri" w:hAnsi="Calibri" w:cs="Calibri"/>
-          <w:sz w:val="22"/>
-          <w:szCs w:val="22"/>
-        </w:rPr>
-        <w:t xml:space="preserve">     * </w:t>
-      </w:r>
-    </w:p>
-    <w:p>
-      <w:pPr>
-        <w:spacing w:after="0"/>
-        <w:rPr>
-          <w:rFonts w:ascii="Calibri" w:hAnsi="Calibri" w:cs="Calibri"/>
-          <w:sz w:val="22"/>
-          <w:szCs w:val="22"/>
-        </w:rPr>
-      </w:pPr>
-      <w:r>
-        <w:rPr>
-          <w:rFonts w:ascii="Calibri" w:hAnsi="Calibri" w:cs="Calibri"/>
-          <w:sz w:val="22"/>
-          <w:szCs w:val="22"/>
-        </w:rPr>
-        <w:t xml:space="preserve">     * @param productID</w:t>
-      </w:r>
-    </w:p>
-    <w:p>
-      <w:pPr>
-        <w:spacing w:after="0"/>
-        <w:rPr>
-          <w:rFonts w:ascii="Calibri" w:hAnsi="Calibri" w:cs="Calibri"/>
-          <w:sz w:val="22"/>
-          <w:szCs w:val="22"/>
-        </w:rPr>
-      </w:pPr>
-      <w:r>
-        <w:rPr>
-          <w:rFonts w:ascii="Calibri" w:hAnsi="Calibri" w:cs="Calibri"/>
-          <w:sz w:val="22"/>
-          <w:szCs w:val="22"/>
-        </w:rPr>
-        <w:t xml:space="preserve">     * @param level</w:t>
-      </w:r>
-    </w:p>
-    <w:p>
-      <w:pPr>
-        <w:spacing w:after="0"/>
-        <w:rPr>
-          <w:rFonts w:ascii="Calibri" w:hAnsi="Calibri" w:cs="Calibri"/>
-          <w:sz w:val="22"/>
-          <w:szCs w:val="22"/>
-        </w:rPr>
-      </w:pPr>
-      <w:r>
-        <w:rPr>
-          <w:rFonts w:ascii="Calibri" w:hAnsi="Calibri" w:cs="Calibri"/>
-          <w:sz w:val="22"/>
-          <w:szCs w:val="22"/>
-        </w:rPr>
-        <w:t xml:space="preserve">     */</w:t>
-      </w:r>
-    </w:p>
-    <w:p>
-      <w:pPr>
-        <w:spacing w:after="0"/>
-        <w:rPr>
-          <w:rFonts w:ascii="Calibri" w:hAnsi="Calibri" w:cs="Calibri"/>
-          <w:sz w:val="22"/>
-          <w:szCs w:val="22"/>
-        </w:rPr>
-      </w:pPr>
-      <w:r>
-        <w:rPr>
-          <w:rFonts w:ascii="Calibri" w:hAnsi="Calibri" w:cs="Calibri"/>
-          <w:sz w:val="22"/>
-          <w:szCs w:val="22"/>
-        </w:rPr>
-        <w:t xml:space="preserve">    public int setMinimumStock(int productID, int level);</w:t>
-      </w:r>
+        <w:t xml:space="preserve">public interface </w:t>
+      </w:r>
+      <w:proofErr w:type="spellStart"/>
+      <w:r>
+        <w:rPr>
+          <w:rFonts w:ascii="Calibri" w:hAnsi="Calibri" w:cs="Calibri"/>
+          <w:sz w:val="22"/>
+          <w:szCs w:val="22"/>
+        </w:rPr>
+        <w:t>I_IPOS_SA_ProductCatalogue</w:t>
+      </w:r>
+      <w:proofErr w:type="spellEnd"/>
+      <w:r>
+        <w:rPr>
+          <w:rFonts w:ascii="Calibri" w:hAnsi="Calibri" w:cs="Calibri"/>
+          <w:sz w:val="22"/>
+          <w:szCs w:val="22"/>
+        </w:rPr>
+        <w:t xml:space="preserve"> {</w:t>
+      </w:r>
+    </w:p>
+    <w:p>
+      <w:pPr>
+        <w:spacing w:after="0"/>
+        <w:rPr>
+          <w:rFonts w:ascii="Calibri" w:hAnsi="Calibri" w:cs="Calibri"/>
+          <w:sz w:val="22"/>
+          <w:szCs w:val="22"/>
+        </w:rPr>
+      </w:pPr>
+    </w:p>
+    <w:p>
+      <w:pPr>
+        <w:spacing w:after="0"/>
+        <w:rPr>
+          <w:rFonts w:ascii="Calibri" w:hAnsi="Calibri" w:cs="Calibri"/>
+          <w:sz w:val="22"/>
+          <w:szCs w:val="22"/>
+        </w:rPr>
+      </w:pPr>
+      <w:r>
+        <w:rPr>
+          <w:rFonts w:ascii="Calibri" w:hAnsi="Calibri" w:cs="Calibri"/>
+          <w:sz w:val="22"/>
+          <w:szCs w:val="22"/>
+        </w:rPr>
+        <w:t xml:space="preserve">  </w:t>
+      </w:r>
+      <w:r>
+        <w:rPr>
+          <w:rFonts w:ascii="Calibri" w:hAnsi="Calibri" w:cs="Calibri"/>
+          <w:sz w:val="22"/>
+          <w:szCs w:val="22"/>
+        </w:rPr>
+        <w:t>/**</w:t>
+      </w:r>
+    </w:p>
+    <w:p>
+      <w:pPr>
+        <w:spacing w:after="0"/>
+        <w:rPr>
+          <w:rFonts w:ascii="Calibri" w:hAnsi="Calibri" w:cs="Calibri"/>
+          <w:sz w:val="22"/>
+          <w:szCs w:val="22"/>
+        </w:rPr>
+      </w:pPr>
+      <w:r>
+        <w:rPr>
+          <w:rFonts w:ascii="Calibri" w:hAnsi="Calibri" w:cs="Calibri"/>
+          <w:sz w:val="22"/>
+          <w:szCs w:val="22"/>
+        </w:rPr>
+        <w:t xml:space="preserve"> * Retrieves a product from the Sales Administration (SA) catalogue.</w:t>
+      </w:r>
+    </w:p>
+    <w:p>
+      <w:pPr>
+        <w:spacing w:after="0"/>
+        <w:rPr>
+          <w:rFonts w:ascii="Calibri" w:hAnsi="Calibri" w:cs="Calibri"/>
+          <w:sz w:val="22"/>
+          <w:szCs w:val="22"/>
+        </w:rPr>
+      </w:pPr>
+      <w:r>
+        <w:rPr>
+          <w:rFonts w:ascii="Calibri" w:hAnsi="Calibri" w:cs="Calibri"/>
+          <w:sz w:val="22"/>
+          <w:szCs w:val="22"/>
+        </w:rPr>
+        <w:t xml:space="preserve"> *</w:t>
+      </w:r>
+    </w:p>
+    <w:p>
+      <w:pPr>
+        <w:spacing w:after="0"/>
+        <w:rPr>
+          <w:rFonts w:ascii="Calibri" w:hAnsi="Calibri" w:cs="Calibri"/>
+          <w:sz w:val="22"/>
+          <w:szCs w:val="22"/>
+        </w:rPr>
+      </w:pPr>
+      <w:r>
+        <w:rPr>
+          <w:rFonts w:ascii="Calibri" w:hAnsi="Calibri" w:cs="Calibri"/>
+          <w:sz w:val="22"/>
+          <w:szCs w:val="22"/>
+        </w:rPr>
+        <w:t xml:space="preserve"> * @param </w:t>
+      </w:r>
+      <w:proofErr w:type="spellStart"/>
+      <w:r>
+        <w:rPr>
+          <w:rFonts w:ascii="Calibri" w:hAnsi="Calibri" w:cs="Calibri"/>
+          <w:sz w:val="22"/>
+          <w:szCs w:val="22"/>
+        </w:rPr>
+        <w:t>productID</w:t>
+      </w:r>
+      <w:proofErr w:type="spellEnd"/>
+      <w:r>
+        <w:rPr>
+          <w:rFonts w:ascii="Calibri" w:hAnsi="Calibri" w:cs="Calibri"/>
+          <w:sz w:val="22"/>
+          <w:szCs w:val="22"/>
+        </w:rPr>
+        <w:t xml:space="preserve"> the unique identifier of the product.</w:t>
+      </w:r>
+    </w:p>
+    <w:p>
+      <w:pPr>
+        <w:spacing w:after="0"/>
+        <w:rPr>
+          <w:rFonts w:ascii="Calibri" w:hAnsi="Calibri" w:cs="Calibri"/>
+          <w:sz w:val="22"/>
+          <w:szCs w:val="22"/>
+        </w:rPr>
+      </w:pPr>
+      <w:r>
+        <w:rPr>
+          <w:rFonts w:ascii="Calibri" w:hAnsi="Calibri" w:cs="Calibri"/>
+          <w:sz w:val="22"/>
+          <w:szCs w:val="22"/>
+        </w:rPr>
+        <w:t xml:space="preserve"> * Constraint: must not be null or empty; must refer to an existing product in the datastore.</w:t>
+      </w:r>
+    </w:p>
+    <w:p>
+      <w:pPr>
+        <w:spacing w:after="0"/>
+        <w:rPr>
+          <w:rFonts w:ascii="Calibri" w:hAnsi="Calibri" w:cs="Calibri"/>
+          <w:sz w:val="22"/>
+          <w:szCs w:val="22"/>
+        </w:rPr>
+      </w:pPr>
+      <w:r>
+        <w:rPr>
+          <w:rFonts w:ascii="Calibri" w:hAnsi="Calibri" w:cs="Calibri"/>
+          <w:sz w:val="22"/>
+          <w:szCs w:val="22"/>
+        </w:rPr>
+        <w:t xml:space="preserve"> */</w:t>
+      </w:r>
+    </w:p>
+    <w:p>
+      <w:pPr>
+        <w:spacing w:after="0"/>
+        <w:rPr>
+          <w:rFonts w:ascii="Calibri" w:hAnsi="Calibri" w:cs="Calibri"/>
+          <w:sz w:val="22"/>
+          <w:szCs w:val="22"/>
+        </w:rPr>
+      </w:pPr>
+    </w:p>
+    <w:p>
+      <w:pPr>
+        <w:spacing w:after="0"/>
+        <w:rPr>
+          <w:rFonts w:ascii="Calibri" w:hAnsi="Calibri" w:cs="Calibri"/>
+          <w:sz w:val="22"/>
+          <w:szCs w:val="22"/>
+        </w:rPr>
+      </w:pPr>
+      <w:r>
+        <w:rPr>
+          <w:rFonts w:ascii="Calibri" w:hAnsi="Calibri" w:cs="Calibri"/>
+          <w:sz w:val="22"/>
+          <w:szCs w:val="22"/>
+        </w:rPr>
+        <w:t xml:space="preserve">public Product </w:t>
+      </w:r>
+      <w:proofErr w:type="spellStart"/>
+      <w:proofErr w:type="gramStart"/>
+      <w:r>
+        <w:rPr>
+          <w:rFonts w:ascii="Calibri" w:hAnsi="Calibri" w:cs="Calibri"/>
+          <w:sz w:val="22"/>
+          <w:szCs w:val="22"/>
+        </w:rPr>
+        <w:t>getProduct</w:t>
+      </w:r>
+      <w:proofErr w:type="spellEnd"/>
+      <w:r>
+        <w:rPr>
+          <w:rFonts w:ascii="Calibri" w:hAnsi="Calibri" w:cs="Calibri"/>
+          <w:sz w:val="22"/>
+          <w:szCs w:val="22"/>
+        </w:rPr>
+        <w:t>(</w:t>
+      </w:r>
+      <w:proofErr w:type="gramEnd"/>
+      <w:r>
+        <w:rPr>
+          <w:rFonts w:ascii="Calibri" w:hAnsi="Calibri" w:cs="Calibri"/>
+          <w:sz w:val="22"/>
+          <w:szCs w:val="22"/>
+        </w:rPr>
+        <w:t xml:space="preserve">String </w:t>
+      </w:r>
+      <w:proofErr w:type="spellStart"/>
+      <w:r>
+        <w:rPr>
+          <w:rFonts w:ascii="Calibri" w:hAnsi="Calibri" w:cs="Calibri"/>
+          <w:sz w:val="22"/>
+          <w:szCs w:val="22"/>
+        </w:rPr>
+        <w:t>productID</w:t>
+      </w:r>
+      <w:proofErr w:type="spellEnd"/>
+      <w:proofErr w:type="gramStart"/>
+      <w:r>
+        <w:rPr>
+          <w:rFonts w:ascii="Calibri" w:hAnsi="Calibri" w:cs="Calibri"/>
+          <w:sz w:val="22"/>
+          <w:szCs w:val="22"/>
+        </w:rPr>
+        <w:t>);</w:t>
+      </w:r>
+      <w:proofErr w:type="gramEnd"/>
+    </w:p>
+    <w:p>
+      <w:pPr>
+        <w:spacing w:after="0"/>
+        <w:rPr>
+          <w:rFonts w:ascii="Calibri" w:hAnsi="Calibri" w:cs="Calibri"/>
+          <w:sz w:val="22"/>
+          <w:szCs w:val="22"/>
+        </w:rPr>
+      </w:pPr>
+      <w:r>
+        <w:rPr>
+          <w:rFonts w:ascii="Calibri" w:hAnsi="Calibri" w:cs="Calibri"/>
+          <w:sz w:val="22"/>
+          <w:szCs w:val="22"/>
+        </w:rPr>
+        <w:t>/**</w:t>
+      </w:r>
+    </w:p>
+    <w:p>
+      <w:pPr>
+        <w:spacing w:after="0"/>
+        <w:rPr>
+          <w:rFonts w:ascii="Calibri" w:hAnsi="Calibri" w:cs="Calibri"/>
+          <w:sz w:val="22"/>
+          <w:szCs w:val="22"/>
+        </w:rPr>
+      </w:pPr>
+      <w:r>
+        <w:rPr>
+          <w:rFonts w:ascii="Calibri" w:hAnsi="Calibri" w:cs="Calibri"/>
+          <w:sz w:val="22"/>
+          <w:szCs w:val="22"/>
+        </w:rPr>
+        <w:t xml:space="preserve"> * Lists all products currently available in the catalogue.</w:t>
+      </w:r>
+    </w:p>
+    <w:p>
+      <w:pPr>
+        <w:spacing w:after="0"/>
+        <w:rPr>
+          <w:rFonts w:ascii="Calibri" w:hAnsi="Calibri" w:cs="Calibri"/>
+          <w:sz w:val="22"/>
+          <w:szCs w:val="22"/>
+        </w:rPr>
+      </w:pPr>
+      <w:r>
+        <w:rPr>
+          <w:rFonts w:ascii="Calibri" w:hAnsi="Calibri" w:cs="Calibri"/>
+          <w:sz w:val="22"/>
+          <w:szCs w:val="22"/>
+        </w:rPr>
+        <w:t xml:space="preserve"> *</w:t>
+      </w:r>
+    </w:p>
+    <w:p>
+      <w:pPr>
+        <w:spacing w:after="0"/>
+        <w:rPr>
+          <w:rFonts w:ascii="Calibri" w:hAnsi="Calibri" w:cs="Calibri"/>
+          <w:sz w:val="22"/>
+          <w:szCs w:val="22"/>
+        </w:rPr>
+      </w:pPr>
+      <w:r>
+        <w:rPr>
+          <w:rFonts w:ascii="Calibri" w:hAnsi="Calibri" w:cs="Calibri"/>
+          <w:sz w:val="22"/>
+          <w:szCs w:val="22"/>
+        </w:rPr>
+        <w:t xml:space="preserve"> * Constraint: may return an empty array if no products are available.</w:t>
+      </w:r>
+    </w:p>
+    <w:p>
+      <w:pPr>
+        <w:spacing w:after="0"/>
+        <w:rPr>
+          <w:rFonts w:ascii="Calibri" w:hAnsi="Calibri" w:cs="Calibri"/>
+          <w:sz w:val="22"/>
+          <w:szCs w:val="22"/>
+        </w:rPr>
+      </w:pPr>
+      <w:r>
+        <w:rPr>
+          <w:rFonts w:ascii="Calibri" w:hAnsi="Calibri" w:cs="Calibri"/>
+          <w:sz w:val="22"/>
+          <w:szCs w:val="22"/>
+        </w:rPr>
+        <w:t xml:space="preserve"> */</w:t>
+      </w:r>
+    </w:p>
+    <w:p>
+      <w:pPr>
+        <w:spacing w:after="0"/>
+        <w:rPr>
+          <w:rFonts w:ascii="Calibri" w:hAnsi="Calibri" w:cs="Calibri"/>
+          <w:sz w:val="22"/>
+          <w:szCs w:val="22"/>
+        </w:rPr>
+      </w:pPr>
+    </w:p>
+    <w:p>
+      <w:pPr>
+        <w:spacing w:after="0"/>
+        <w:rPr>
+          <w:rFonts w:ascii="Calibri" w:hAnsi="Calibri" w:cs="Calibri"/>
+          <w:sz w:val="22"/>
+          <w:szCs w:val="22"/>
+        </w:rPr>
+      </w:pPr>
+      <w:r>
+        <w:rPr>
+          <w:rFonts w:ascii="Calibri" w:hAnsi="Calibri" w:cs="Calibri"/>
+          <w:sz w:val="22"/>
+          <w:szCs w:val="22"/>
+        </w:rPr>
+        <w:t xml:space="preserve">public </w:t>
+      </w:r>
+      <w:proofErr w:type="gramStart"/>
+      <w:r>
+        <w:rPr>
+          <w:rFonts w:ascii="Calibri" w:hAnsi="Calibri" w:cs="Calibri"/>
+          <w:sz w:val="22"/>
+          <w:szCs w:val="22"/>
+        </w:rPr>
+        <w:t>Product[</w:t>
+      </w:r>
+      <w:proofErr w:type="gramEnd"/>
+      <w:r>
+        <w:rPr>
+          <w:rFonts w:ascii="Calibri" w:hAnsi="Calibri" w:cs="Calibri"/>
+          <w:sz w:val="22"/>
+          <w:szCs w:val="22"/>
+        </w:rPr>
+        <w:t xml:space="preserve">] </w:t>
+      </w:r>
+      <w:proofErr w:type="spellStart"/>
+      <w:proofErr w:type="gramStart"/>
+      <w:r>
+        <w:rPr>
+          <w:rFonts w:ascii="Calibri" w:hAnsi="Calibri" w:cs="Calibri"/>
+          <w:sz w:val="22"/>
+          <w:szCs w:val="22"/>
+        </w:rPr>
+        <w:t>listProducts</w:t>
+      </w:r>
+      <w:proofErr w:type="spellEnd"/>
+      <w:r>
+        <w:rPr>
+          <w:rFonts w:ascii="Calibri" w:hAnsi="Calibri" w:cs="Calibri"/>
+          <w:sz w:val="22"/>
+          <w:szCs w:val="22"/>
+        </w:rPr>
+        <w:t>();</w:t>
+      </w:r>
+      <w:proofErr w:type="gramEnd"/>
+    </w:p>
+    <w:p>
+      <w:pPr>
+        <w:spacing w:after="0"/>
+        <w:rPr>
+          <w:rFonts w:ascii="Calibri" w:hAnsi="Calibri" w:cs="Calibri"/>
+          <w:sz w:val="22"/>
+          <w:szCs w:val="22"/>
+        </w:rPr>
+      </w:pPr>
+      <w:r>
+        <w:rPr>
+          <w:rFonts w:ascii="Calibri" w:hAnsi="Calibri" w:cs="Calibri"/>
+          <w:sz w:val="22"/>
+          <w:szCs w:val="22"/>
+        </w:rPr>
+        <w:t>/**</w:t>
+      </w:r>
+    </w:p>
+    <w:p>
+      <w:pPr>
+        <w:spacing w:after="0"/>
+        <w:rPr>
+          <w:rFonts w:ascii="Calibri" w:hAnsi="Calibri" w:cs="Calibri"/>
+          <w:sz w:val="22"/>
+          <w:szCs w:val="22"/>
+        </w:rPr>
+      </w:pPr>
+      <w:r>
+        <w:rPr>
+          <w:rFonts w:ascii="Calibri" w:hAnsi="Calibri" w:cs="Calibri"/>
+          <w:sz w:val="22"/>
+          <w:szCs w:val="22"/>
+        </w:rPr>
+        <w:t xml:space="preserve"> * Adds a new product to the catalogue.</w:t>
+      </w:r>
+    </w:p>
+    <w:p>
+      <w:pPr>
+        <w:spacing w:after="0"/>
+        <w:rPr>
+          <w:rFonts w:ascii="Calibri" w:hAnsi="Calibri" w:cs="Calibri"/>
+          <w:sz w:val="22"/>
+          <w:szCs w:val="22"/>
+        </w:rPr>
+      </w:pPr>
+      <w:r>
+        <w:rPr>
+          <w:rFonts w:ascii="Calibri" w:hAnsi="Calibri" w:cs="Calibri"/>
+          <w:sz w:val="22"/>
+          <w:szCs w:val="22"/>
+        </w:rPr>
+        <w:t xml:space="preserve"> *</w:t>
+      </w:r>
+    </w:p>
+    <w:p>
+      <w:pPr>
+        <w:spacing w:after="0"/>
+        <w:rPr>
+          <w:rFonts w:ascii="Calibri" w:hAnsi="Calibri" w:cs="Calibri"/>
+          <w:sz w:val="22"/>
+          <w:szCs w:val="22"/>
+        </w:rPr>
+      </w:pPr>
+      <w:r>
+        <w:rPr>
+          <w:rFonts w:ascii="Calibri" w:hAnsi="Calibri" w:cs="Calibri"/>
+          <w:sz w:val="22"/>
+          <w:szCs w:val="22"/>
+        </w:rPr>
+        <w:t xml:space="preserve"> * @param product the product object to add.</w:t>
+      </w:r>
+    </w:p>
+    <w:p>
+      <w:pPr>
+        <w:spacing w:after="0"/>
+        <w:rPr>
+          <w:rFonts w:ascii="Calibri" w:hAnsi="Calibri" w:cs="Calibri"/>
+          <w:sz w:val="22"/>
+          <w:szCs w:val="22"/>
+        </w:rPr>
+      </w:pPr>
+      <w:r>
+        <w:rPr>
+          <w:rFonts w:ascii="Calibri" w:hAnsi="Calibri" w:cs="Calibri"/>
+          <w:sz w:val="22"/>
+          <w:szCs w:val="22"/>
+        </w:rPr>
+        <w:t xml:space="preserve"> * Constraint: must not be null; product ID must be unique; price should be &gt;= 0.</w:t>
+      </w:r>
+    </w:p>
+    <w:p>
+      <w:pPr>
+        <w:spacing w:after="0"/>
+        <w:rPr>
+          <w:rFonts w:ascii="Calibri" w:hAnsi="Calibri" w:cs="Calibri"/>
+          <w:sz w:val="22"/>
+          <w:szCs w:val="22"/>
+        </w:rPr>
+      </w:pPr>
+      <w:r>
+        <w:rPr>
+          <w:rFonts w:ascii="Calibri" w:hAnsi="Calibri" w:cs="Calibri"/>
+          <w:sz w:val="22"/>
+          <w:szCs w:val="22"/>
+        </w:rPr>
+        <w:t xml:space="preserve"> */</w:t>
+      </w:r>
+    </w:p>
+    <w:p>
+      <w:pPr>
+        <w:spacing w:after="0"/>
+        <w:rPr>
+          <w:rFonts w:ascii="Calibri" w:hAnsi="Calibri" w:cs="Calibri"/>
+          <w:sz w:val="22"/>
+          <w:szCs w:val="22"/>
+        </w:rPr>
+      </w:pPr>
+    </w:p>
+    <w:p>
+      <w:pPr>
+        <w:spacing w:after="0"/>
+        <w:rPr>
+          <w:rFonts w:ascii="Calibri" w:hAnsi="Calibri" w:cs="Calibri"/>
+          <w:sz w:val="22"/>
+          <w:szCs w:val="22"/>
+        </w:rPr>
+      </w:pPr>
+      <w:r>
+        <w:rPr>
+          <w:rFonts w:ascii="Calibri" w:hAnsi="Calibri" w:cs="Calibri"/>
+          <w:sz w:val="22"/>
+          <w:szCs w:val="22"/>
+        </w:rPr>
+        <w:t xml:space="preserve">public int </w:t>
+      </w:r>
+      <w:proofErr w:type="spellStart"/>
+      <w:proofErr w:type="gramStart"/>
+      <w:r>
+        <w:rPr>
+          <w:rFonts w:ascii="Calibri" w:hAnsi="Calibri" w:cs="Calibri"/>
+          <w:sz w:val="22"/>
+          <w:szCs w:val="22"/>
+        </w:rPr>
+        <w:t>addProduct</w:t>
+      </w:r>
+      <w:proofErr w:type="spellEnd"/>
+      <w:r>
+        <w:rPr>
+          <w:rFonts w:ascii="Calibri" w:hAnsi="Calibri" w:cs="Calibri"/>
+          <w:sz w:val="22"/>
+          <w:szCs w:val="22"/>
+        </w:rPr>
+        <w:t>(</w:t>
+      </w:r>
+      <w:proofErr w:type="gramEnd"/>
+      <w:r>
+        <w:rPr>
+          <w:rFonts w:ascii="Calibri" w:hAnsi="Calibri" w:cs="Calibri"/>
+          <w:sz w:val="22"/>
+          <w:szCs w:val="22"/>
+        </w:rPr>
+        <w:t>Product product</w:t>
+      </w:r>
+      <w:proofErr w:type="gramStart"/>
+      <w:r>
+        <w:rPr>
+          <w:rFonts w:ascii="Calibri" w:hAnsi="Calibri" w:cs="Calibri"/>
+          <w:sz w:val="22"/>
+          <w:szCs w:val="22"/>
+        </w:rPr>
+        <w:t>);</w:t>
+      </w:r>
+      <w:proofErr w:type="gramEnd"/>
+    </w:p>
+    <w:p>
+      <w:pPr>
+        <w:spacing w:after="0"/>
+        <w:rPr>
+          <w:rFonts w:ascii="Calibri" w:hAnsi="Calibri" w:cs="Calibri"/>
+          <w:sz w:val="22"/>
+          <w:szCs w:val="22"/>
+        </w:rPr>
+      </w:pPr>
+      <w:r>
+        <w:rPr>
+          <w:rFonts w:ascii="Calibri" w:hAnsi="Calibri" w:cs="Calibri"/>
+          <w:sz w:val="22"/>
+          <w:szCs w:val="22"/>
+        </w:rPr>
+        <w:t>/**</w:t>
+      </w:r>
+    </w:p>
+    <w:p>
+      <w:pPr>
+        <w:spacing w:after="0"/>
+        <w:rPr>
+          <w:rFonts w:ascii="Calibri" w:hAnsi="Calibri" w:cs="Calibri"/>
+          <w:sz w:val="22"/>
+          <w:szCs w:val="22"/>
+        </w:rPr>
+      </w:pPr>
+      <w:r>
+        <w:rPr>
+          <w:rFonts w:ascii="Calibri" w:hAnsi="Calibri" w:cs="Calibri"/>
+          <w:sz w:val="22"/>
+          <w:szCs w:val="22"/>
+        </w:rPr>
+        <w:t xml:space="preserve"> * Updates the stock level for a given product.</w:t>
+      </w:r>
+    </w:p>
+    <w:p>
+      <w:pPr>
+        <w:spacing w:after="0"/>
+        <w:rPr>
+          <w:rFonts w:ascii="Calibri" w:hAnsi="Calibri" w:cs="Calibri"/>
+          <w:sz w:val="22"/>
+          <w:szCs w:val="22"/>
+        </w:rPr>
+      </w:pPr>
+      <w:r>
+        <w:rPr>
+          <w:rFonts w:ascii="Calibri" w:hAnsi="Calibri" w:cs="Calibri"/>
+          <w:sz w:val="22"/>
+          <w:szCs w:val="22"/>
+        </w:rPr>
+        <w:t xml:space="preserve"> *</w:t>
+      </w:r>
+    </w:p>
+    <w:p>
+      <w:pPr>
+        <w:spacing w:after="0"/>
+        <w:rPr>
+          <w:rFonts w:ascii="Calibri" w:hAnsi="Calibri" w:cs="Calibri"/>
+          <w:sz w:val="22"/>
+          <w:szCs w:val="22"/>
+        </w:rPr>
+      </w:pPr>
+      <w:r>
+        <w:rPr>
+          <w:rFonts w:ascii="Calibri" w:hAnsi="Calibri" w:cs="Calibri"/>
+          <w:sz w:val="22"/>
+          <w:szCs w:val="22"/>
+        </w:rPr>
+        <w:t xml:space="preserve"> * @param </w:t>
+      </w:r>
+      <w:proofErr w:type="spellStart"/>
+      <w:r>
+        <w:rPr>
+          <w:rFonts w:ascii="Calibri" w:hAnsi="Calibri" w:cs="Calibri"/>
+          <w:sz w:val="22"/>
+          <w:szCs w:val="22"/>
+        </w:rPr>
+        <w:t>productID</w:t>
+      </w:r>
+      <w:proofErr w:type="spellEnd"/>
+      <w:r>
+        <w:rPr>
+          <w:rFonts w:ascii="Calibri" w:hAnsi="Calibri" w:cs="Calibri"/>
+          <w:sz w:val="22"/>
+          <w:szCs w:val="22"/>
+        </w:rPr>
+        <w:t xml:space="preserve"> the identifier of the product to update.</w:t>
+      </w:r>
+    </w:p>
+    <w:p>
+      <w:pPr>
+        <w:spacing w:after="0"/>
+        <w:rPr>
+          <w:rFonts w:ascii="Calibri" w:hAnsi="Calibri" w:cs="Calibri"/>
+          <w:sz w:val="22"/>
+          <w:szCs w:val="22"/>
+        </w:rPr>
+      </w:pPr>
+      <w:r>
+        <w:rPr>
+          <w:rFonts w:ascii="Calibri" w:hAnsi="Calibri" w:cs="Calibri"/>
+          <w:sz w:val="22"/>
+          <w:szCs w:val="22"/>
+        </w:rPr>
+        <w:t xml:space="preserve"> * Constraint: must refer to an existing product.</w:t>
+      </w:r>
+    </w:p>
+    <w:p>
+      <w:pPr>
+        <w:spacing w:after="0"/>
+        <w:rPr>
+          <w:rFonts w:ascii="Calibri" w:hAnsi="Calibri" w:cs="Calibri"/>
+          <w:sz w:val="22"/>
+          <w:szCs w:val="22"/>
+        </w:rPr>
+      </w:pPr>
+      <w:r>
+        <w:rPr>
+          <w:rFonts w:ascii="Calibri" w:hAnsi="Calibri" w:cs="Calibri"/>
+          <w:sz w:val="22"/>
+          <w:szCs w:val="22"/>
+        </w:rPr>
+        <w:t xml:space="preserve"> * @param quantity the new stock quantity.</w:t>
+      </w:r>
+    </w:p>
+    <w:p>
+      <w:pPr>
+        <w:spacing w:after="0"/>
+        <w:rPr>
+          <w:rFonts w:ascii="Calibri" w:hAnsi="Calibri" w:cs="Calibri"/>
+          <w:sz w:val="22"/>
+          <w:szCs w:val="22"/>
+        </w:rPr>
+      </w:pPr>
+      <w:r>
+        <w:rPr>
+          <w:rFonts w:ascii="Calibri" w:hAnsi="Calibri" w:cs="Calibri"/>
+          <w:sz w:val="22"/>
+          <w:szCs w:val="22"/>
+        </w:rPr>
+        <w:t xml:space="preserve"> * Constraint: must be &gt;= 0 (stock cannot be negative).</w:t>
+      </w:r>
+    </w:p>
+    <w:p>
+      <w:pPr>
+        <w:spacing w:after="0"/>
+        <w:rPr>
+          <w:rFonts w:ascii="Calibri" w:hAnsi="Calibri" w:cs="Calibri"/>
+          <w:sz w:val="22"/>
+          <w:szCs w:val="22"/>
+        </w:rPr>
+      </w:pPr>
+      <w:r>
+        <w:rPr>
+          <w:rFonts w:ascii="Calibri" w:hAnsi="Calibri" w:cs="Calibri"/>
+          <w:sz w:val="22"/>
+          <w:szCs w:val="22"/>
+        </w:rPr>
+        <w:t xml:space="preserve"> */</w:t>
+      </w:r>
+    </w:p>
+    <w:p>
+      <w:pPr>
+        <w:spacing w:after="0"/>
+        <w:rPr>
+          <w:rFonts w:ascii="Calibri" w:hAnsi="Calibri" w:cs="Calibri"/>
+          <w:sz w:val="22"/>
+          <w:szCs w:val="22"/>
+        </w:rPr>
+      </w:pPr>
+    </w:p>
+    <w:p>
+      <w:pPr>
+        <w:spacing w:after="0"/>
+        <w:rPr>
+          <w:rFonts w:ascii="Calibri" w:hAnsi="Calibri" w:cs="Calibri"/>
+          <w:sz w:val="22"/>
+          <w:szCs w:val="22"/>
+        </w:rPr>
+      </w:pPr>
+      <w:r>
+        <w:rPr>
+          <w:rFonts w:ascii="Calibri" w:hAnsi="Calibri" w:cs="Calibri"/>
+          <w:sz w:val="22"/>
+          <w:szCs w:val="22"/>
+        </w:rPr>
+        <w:t xml:space="preserve">public int </w:t>
+      </w:r>
+      <w:proofErr w:type="spellStart"/>
+      <w:proofErr w:type="gramStart"/>
+      <w:r>
+        <w:rPr>
+          <w:rFonts w:ascii="Calibri" w:hAnsi="Calibri" w:cs="Calibri"/>
+          <w:sz w:val="22"/>
+          <w:szCs w:val="22"/>
+        </w:rPr>
+        <w:t>updateStock</w:t>
+      </w:r>
+      <w:proofErr w:type="spellEnd"/>
+      <w:r>
+        <w:rPr>
+          <w:rFonts w:ascii="Calibri" w:hAnsi="Calibri" w:cs="Calibri"/>
+          <w:sz w:val="22"/>
+          <w:szCs w:val="22"/>
+        </w:rPr>
+        <w:t>(</w:t>
+      </w:r>
+      <w:proofErr w:type="gramEnd"/>
+      <w:r>
+        <w:rPr>
+          <w:rFonts w:ascii="Calibri" w:hAnsi="Calibri" w:cs="Calibri"/>
+          <w:sz w:val="22"/>
+          <w:szCs w:val="22"/>
+        </w:rPr>
+        <w:t xml:space="preserve">int </w:t>
+      </w:r>
+      <w:proofErr w:type="spellStart"/>
+      <w:r>
+        <w:rPr>
+          <w:rFonts w:ascii="Calibri" w:hAnsi="Calibri" w:cs="Calibri"/>
+          <w:sz w:val="22"/>
+          <w:szCs w:val="22"/>
+        </w:rPr>
+        <w:t>productID</w:t>
+      </w:r>
+      <w:proofErr w:type="spellEnd"/>
+      <w:r>
+        <w:rPr>
+          <w:rFonts w:ascii="Calibri" w:hAnsi="Calibri" w:cs="Calibri"/>
+          <w:sz w:val="22"/>
+          <w:szCs w:val="22"/>
+        </w:rPr>
+        <w:t>, int quantity</w:t>
+      </w:r>
+      <w:proofErr w:type="gramStart"/>
+      <w:r>
+        <w:rPr>
+          <w:rFonts w:ascii="Calibri" w:hAnsi="Calibri" w:cs="Calibri"/>
+          <w:sz w:val="22"/>
+          <w:szCs w:val="22"/>
+        </w:rPr>
+        <w:t>);</w:t>
+      </w:r>
+      <w:proofErr w:type="gramEnd"/>
+    </w:p>
+    <w:p>
+      <w:pPr>
+        <w:spacing w:after="0"/>
+        <w:rPr>
+          <w:rFonts w:ascii="Calibri" w:hAnsi="Calibri" w:cs="Calibri"/>
+          <w:sz w:val="22"/>
+          <w:szCs w:val="22"/>
+        </w:rPr>
+      </w:pPr>
+      <w:r>
+        <w:rPr>
+          <w:rFonts w:ascii="Calibri" w:hAnsi="Calibri" w:cs="Calibri"/>
+          <w:sz w:val="22"/>
+          <w:szCs w:val="22"/>
+        </w:rPr>
+        <w:t>/**</w:t>
+      </w:r>
+    </w:p>
+    <w:p>
+      <w:pPr>
+        <w:spacing w:after="0"/>
+        <w:rPr>
+          <w:rFonts w:ascii="Calibri" w:hAnsi="Calibri" w:cs="Calibri"/>
+          <w:sz w:val="22"/>
+          <w:szCs w:val="22"/>
+        </w:rPr>
+      </w:pPr>
+      <w:r>
+        <w:rPr>
+          <w:rFonts w:ascii="Calibri" w:hAnsi="Calibri" w:cs="Calibri"/>
+          <w:sz w:val="22"/>
+          <w:szCs w:val="22"/>
+        </w:rPr>
+        <w:t xml:space="preserve"> * Retrieves products whose stock level is below the defined minimum threshold.</w:t>
+      </w:r>
+    </w:p>
+    <w:p>
+      <w:pPr>
+        <w:spacing w:after="0"/>
+        <w:rPr>
+          <w:rFonts w:ascii="Calibri" w:hAnsi="Calibri" w:cs="Calibri"/>
+          <w:sz w:val="22"/>
+          <w:szCs w:val="22"/>
+        </w:rPr>
+      </w:pPr>
+      <w:r>
+        <w:rPr>
+          <w:rFonts w:ascii="Calibri" w:hAnsi="Calibri" w:cs="Calibri"/>
+          <w:sz w:val="22"/>
+          <w:szCs w:val="22"/>
+        </w:rPr>
+        <w:t xml:space="preserve"> *</w:t>
+      </w:r>
+    </w:p>
+    <w:p>
+      <w:pPr>
+        <w:spacing w:after="0"/>
+        <w:rPr>
+          <w:rFonts w:ascii="Calibri" w:hAnsi="Calibri" w:cs="Calibri"/>
+          <w:sz w:val="22"/>
+          <w:szCs w:val="22"/>
+        </w:rPr>
+      </w:pPr>
+      <w:r>
+        <w:rPr>
+          <w:rFonts w:ascii="Calibri" w:hAnsi="Calibri" w:cs="Calibri"/>
+          <w:sz w:val="22"/>
+          <w:szCs w:val="22"/>
+        </w:rPr>
+        <w:t xml:space="preserve"> * Constraint: threshold values must be defined for products in the system.</w:t>
+      </w:r>
+    </w:p>
+    <w:p>
+      <w:pPr>
+        <w:spacing w:after="0"/>
+        <w:rPr>
+          <w:rFonts w:ascii="Calibri" w:hAnsi="Calibri" w:cs="Calibri"/>
+          <w:sz w:val="22"/>
+          <w:szCs w:val="22"/>
+        </w:rPr>
+      </w:pPr>
+      <w:r>
+        <w:rPr>
+          <w:rFonts w:ascii="Calibri" w:hAnsi="Calibri" w:cs="Calibri"/>
+          <w:sz w:val="22"/>
+          <w:szCs w:val="22"/>
+        </w:rPr>
+        <w:t xml:space="preserve"> */</w:t>
+      </w:r>
+    </w:p>
+    <w:p>
+      <w:pPr>
+        <w:spacing w:after="0"/>
+        <w:rPr>
+          <w:rFonts w:ascii="Calibri" w:hAnsi="Calibri" w:cs="Calibri"/>
+          <w:sz w:val="22"/>
+          <w:szCs w:val="22"/>
+        </w:rPr>
+      </w:pPr>
+    </w:p>
+    <w:p>
+      <w:pPr>
+        <w:spacing w:after="0"/>
+        <w:rPr>
+          <w:rFonts w:ascii="Calibri" w:hAnsi="Calibri" w:cs="Calibri"/>
+          <w:sz w:val="22"/>
+          <w:szCs w:val="22"/>
+        </w:rPr>
+      </w:pPr>
+      <w:r>
+        <w:rPr>
+          <w:rFonts w:ascii="Calibri" w:hAnsi="Calibri" w:cs="Calibri"/>
+          <w:sz w:val="22"/>
+          <w:szCs w:val="22"/>
+        </w:rPr>
+        <w:t xml:space="preserve">public </w:t>
+      </w:r>
+      <w:proofErr w:type="gramStart"/>
+      <w:r>
+        <w:rPr>
+          <w:rFonts w:ascii="Calibri" w:hAnsi="Calibri" w:cs="Calibri"/>
+          <w:sz w:val="22"/>
+          <w:szCs w:val="22"/>
+        </w:rPr>
+        <w:t>Product[</w:t>
+      </w:r>
+      <w:proofErr w:type="gramEnd"/>
+      <w:r>
+        <w:rPr>
+          <w:rFonts w:ascii="Calibri" w:hAnsi="Calibri" w:cs="Calibri"/>
+          <w:sz w:val="22"/>
+          <w:szCs w:val="22"/>
+        </w:rPr>
+        <w:t xml:space="preserve">] </w:t>
+      </w:r>
+      <w:proofErr w:type="spellStart"/>
+      <w:proofErr w:type="gramStart"/>
+      <w:r>
+        <w:rPr>
+          <w:rFonts w:ascii="Calibri" w:hAnsi="Calibri" w:cs="Calibri"/>
+          <w:sz w:val="22"/>
+          <w:szCs w:val="22"/>
+        </w:rPr>
+        <w:t>getLowStock</w:t>
+      </w:r>
+      <w:proofErr w:type="spellEnd"/>
+      <w:r>
+        <w:rPr>
+          <w:rFonts w:ascii="Calibri" w:hAnsi="Calibri" w:cs="Calibri"/>
+          <w:sz w:val="22"/>
+          <w:szCs w:val="22"/>
+        </w:rPr>
+        <w:t>();</w:t>
+      </w:r>
+      <w:proofErr w:type="gramEnd"/>
+    </w:p>
+    <w:p>
+      <w:pPr>
+        <w:spacing w:after="0"/>
+        <w:rPr>
+          <w:rFonts w:ascii="Calibri" w:hAnsi="Calibri" w:cs="Calibri"/>
+          <w:sz w:val="22"/>
+          <w:szCs w:val="22"/>
+        </w:rPr>
+      </w:pPr>
+      <w:r>
+        <w:rPr>
+          <w:rFonts w:ascii="Calibri" w:hAnsi="Calibri" w:cs="Calibri"/>
+          <w:sz w:val="22"/>
+          <w:szCs w:val="22"/>
+        </w:rPr>
+        <w:t>/**</w:t>
+      </w:r>
+    </w:p>
+    <w:p>
+      <w:pPr>
+        <w:spacing w:after="0"/>
+        <w:rPr>
+          <w:rFonts w:ascii="Calibri" w:hAnsi="Calibri" w:cs="Calibri"/>
+          <w:sz w:val="22"/>
+          <w:szCs w:val="22"/>
+        </w:rPr>
+      </w:pPr>
+      <w:r>
+        <w:rPr>
+          <w:rFonts w:ascii="Calibri" w:hAnsi="Calibri" w:cs="Calibri"/>
+          <w:sz w:val="22"/>
+          <w:szCs w:val="22"/>
+        </w:rPr>
+        <w:t xml:space="preserve"> * Sets the minimum stock threshold for a product.</w:t>
+      </w:r>
+    </w:p>
+    <w:p>
+      <w:pPr>
+        <w:spacing w:after="0"/>
+        <w:rPr>
+          <w:rFonts w:ascii="Calibri" w:hAnsi="Calibri" w:cs="Calibri"/>
+          <w:sz w:val="22"/>
+          <w:szCs w:val="22"/>
+        </w:rPr>
+      </w:pPr>
+      <w:r>
+        <w:rPr>
+          <w:rFonts w:ascii="Calibri" w:hAnsi="Calibri" w:cs="Calibri"/>
+          <w:sz w:val="22"/>
+          <w:szCs w:val="22"/>
+        </w:rPr>
+        <w:t xml:space="preserve"> *</w:t>
+      </w:r>
+    </w:p>
+    <w:p>
+      <w:pPr>
+        <w:spacing w:after="0"/>
+        <w:rPr>
+          <w:rFonts w:ascii="Calibri" w:hAnsi="Calibri" w:cs="Calibri"/>
+          <w:sz w:val="22"/>
+          <w:szCs w:val="22"/>
+        </w:rPr>
+      </w:pPr>
+      <w:r>
+        <w:rPr>
+          <w:rFonts w:ascii="Calibri" w:hAnsi="Calibri" w:cs="Calibri"/>
+          <w:sz w:val="22"/>
+          <w:szCs w:val="22"/>
+        </w:rPr>
+        <w:lastRenderedPageBreak/>
+        <w:t xml:space="preserve"> * @param </w:t>
+      </w:r>
+      <w:proofErr w:type="spellStart"/>
+      <w:r>
+        <w:rPr>
+          <w:rFonts w:ascii="Calibri" w:hAnsi="Calibri" w:cs="Calibri"/>
+          <w:sz w:val="22"/>
+          <w:szCs w:val="22"/>
+        </w:rPr>
+        <w:t>productID</w:t>
+      </w:r>
+      <w:proofErr w:type="spellEnd"/>
+      <w:r>
+        <w:rPr>
+          <w:rFonts w:ascii="Calibri" w:hAnsi="Calibri" w:cs="Calibri"/>
+          <w:sz w:val="22"/>
+          <w:szCs w:val="22"/>
+        </w:rPr>
+        <w:t xml:space="preserve"> the identifier of the product.</w:t>
+      </w:r>
+    </w:p>
+    <w:p>
+      <w:pPr>
+        <w:spacing w:after="0"/>
+        <w:rPr>
+          <w:rFonts w:ascii="Calibri" w:hAnsi="Calibri" w:cs="Calibri"/>
+          <w:sz w:val="22"/>
+          <w:szCs w:val="22"/>
+        </w:rPr>
+      </w:pPr>
+      <w:r>
+        <w:rPr>
+          <w:rFonts w:ascii="Calibri" w:hAnsi="Calibri" w:cs="Calibri"/>
+          <w:sz w:val="22"/>
+          <w:szCs w:val="22"/>
+        </w:rPr>
+        <w:t xml:space="preserve"> * Constraint: must refer to an existing product.</w:t>
+      </w:r>
+    </w:p>
+    <w:p>
+      <w:pPr>
+        <w:spacing w:after="0"/>
+        <w:rPr>
+          <w:rFonts w:ascii="Calibri" w:hAnsi="Calibri" w:cs="Calibri"/>
+          <w:sz w:val="22"/>
+          <w:szCs w:val="22"/>
+        </w:rPr>
+      </w:pPr>
+      <w:r>
+        <w:rPr>
+          <w:rFonts w:ascii="Calibri" w:hAnsi="Calibri" w:cs="Calibri"/>
+          <w:sz w:val="22"/>
+          <w:szCs w:val="22"/>
+        </w:rPr>
+        <w:t xml:space="preserve"> * @param level the minimum stock level.</w:t>
+      </w:r>
+    </w:p>
+    <w:p>
+      <w:pPr>
+        <w:spacing w:after="0"/>
+        <w:rPr>
+          <w:rFonts w:ascii="Calibri" w:hAnsi="Calibri" w:cs="Calibri"/>
+          <w:sz w:val="22"/>
+          <w:szCs w:val="22"/>
+        </w:rPr>
+      </w:pPr>
+      <w:r>
+        <w:rPr>
+          <w:rFonts w:ascii="Calibri" w:hAnsi="Calibri" w:cs="Calibri"/>
+          <w:sz w:val="22"/>
+          <w:szCs w:val="22"/>
+        </w:rPr>
+        <w:t xml:space="preserve"> * Constraint: must be &gt;= 0.</w:t>
+      </w:r>
+    </w:p>
+    <w:p>
+      <w:pPr>
+        <w:spacing w:after="0"/>
+        <w:rPr>
+          <w:rFonts w:ascii="Calibri" w:hAnsi="Calibri" w:cs="Calibri"/>
+          <w:sz w:val="22"/>
+          <w:szCs w:val="22"/>
+        </w:rPr>
+      </w:pPr>
+      <w:r>
+        <w:rPr>
+          <w:rFonts w:ascii="Calibri" w:hAnsi="Calibri" w:cs="Calibri"/>
+          <w:sz w:val="22"/>
+          <w:szCs w:val="22"/>
+        </w:rPr>
+        <w:t xml:space="preserve"> */</w:t>
+      </w:r>
+    </w:p>
+    <w:p>
+      <w:pPr>
+        <w:spacing w:after="0"/>
+        <w:rPr>
+          <w:rFonts w:ascii="Calibri" w:hAnsi="Calibri" w:cs="Calibri"/>
+          <w:sz w:val="22"/>
+          <w:szCs w:val="22"/>
+        </w:rPr>
+      </w:pPr>
+    </w:p>
+    <w:p>
+      <w:pPr>
+        <w:spacing w:after="0"/>
+        <w:rPr>
+          <w:rFonts w:ascii="Calibri" w:hAnsi="Calibri" w:cs="Calibri"/>
+          <w:sz w:val="22"/>
+          <w:szCs w:val="22"/>
+        </w:rPr>
+      </w:pPr>
+      <w:r>
+        <w:rPr>
+          <w:rFonts w:ascii="Calibri" w:hAnsi="Calibri" w:cs="Calibri"/>
+          <w:sz w:val="22"/>
+          <w:szCs w:val="22"/>
+        </w:rPr>
+        <w:t xml:space="preserve">public int </w:t>
+      </w:r>
+      <w:proofErr w:type="spellStart"/>
+      <w:proofErr w:type="gramStart"/>
+      <w:r>
+        <w:rPr>
+          <w:rFonts w:ascii="Calibri" w:hAnsi="Calibri" w:cs="Calibri"/>
+          <w:sz w:val="22"/>
+          <w:szCs w:val="22"/>
+        </w:rPr>
+        <w:t>setMinimumStock</w:t>
+      </w:r>
+      <w:proofErr w:type="spellEnd"/>
+      <w:r>
+        <w:rPr>
+          <w:rFonts w:ascii="Calibri" w:hAnsi="Calibri" w:cs="Calibri"/>
+          <w:sz w:val="22"/>
+          <w:szCs w:val="22"/>
+        </w:rPr>
+        <w:t>(</w:t>
+      </w:r>
+      <w:proofErr w:type="gramEnd"/>
+      <w:r>
+        <w:rPr>
+          <w:rFonts w:ascii="Calibri" w:hAnsi="Calibri" w:cs="Calibri"/>
+          <w:sz w:val="22"/>
+          <w:szCs w:val="22"/>
+        </w:rPr>
+        <w:t xml:space="preserve">int </w:t>
+      </w:r>
+      <w:proofErr w:type="spellStart"/>
+      <w:r>
+        <w:rPr>
+          <w:rFonts w:ascii="Calibri" w:hAnsi="Calibri" w:cs="Calibri"/>
+          <w:sz w:val="22"/>
+          <w:szCs w:val="22"/>
+        </w:rPr>
+        <w:t>productID</w:t>
+      </w:r>
+      <w:proofErr w:type="spellEnd"/>
+      <w:r>
+        <w:rPr>
+          <w:rFonts w:ascii="Calibri" w:hAnsi="Calibri" w:cs="Calibri"/>
+          <w:sz w:val="22"/>
+          <w:szCs w:val="22"/>
+        </w:rPr>
+        <w:t>, int level</w:t>
+      </w:r>
+      <w:proofErr w:type="gramStart"/>
+      <w:r>
+        <w:rPr>
+          <w:rFonts w:ascii="Calibri" w:hAnsi="Calibri" w:cs="Calibri"/>
+          <w:sz w:val="22"/>
+          <w:szCs w:val="22"/>
+        </w:rPr>
+        <w:t>);</w:t>
+      </w:r>
+      <w:proofErr w:type="gramEnd"/>
     </w:p>
     <w:p>
       <w:pPr>
@@ -2389,444 +2972,7 @@
           <w:sz w:val="22"/>
           <w:szCs w:val="22"/>
         </w:rPr>
-        <w:t>}</w:t>
-      </w:r>
-    </w:p>
-    <w:p>
-      <w:pPr>
-        <w:spacing w:after="0"/>
-        <w:rPr>
-          <w:rFonts w:ascii="Calibri" w:hAnsi="Calibri" w:cs="Calibri"/>
-          <w:sz w:val="22"/>
-          <w:szCs w:val="22"/>
-        </w:rPr>
-      </w:pPr>
-    </w:p>
-    <w:p>
-      <w:pPr>
-        <w:spacing w:after="0"/>
-        <w:rPr>
-          <w:rFonts w:ascii="Calibri" w:hAnsi="Calibri" w:cs="Calibri"/>
-          <w:sz w:val="22"/>
-          <w:szCs w:val="22"/>
-        </w:rPr>
-      </w:pPr>
-      <w:r>
-        <w:rPr>
-          <w:rFonts w:ascii="Calibri" w:hAnsi="Calibri" w:cs="Calibri"/>
-          <w:sz w:val="22"/>
-          <w:szCs w:val="22"/>
-        </w:rPr>
-        <w:t>public interface I_IPOS_PU {</w:t>
-      </w:r>
-    </w:p>
-    <w:p>
-      <w:pPr>
-        <w:spacing w:after="0"/>
-        <w:rPr>
-          <w:rFonts w:ascii="Calibri" w:hAnsi="Calibri" w:cs="Calibri"/>
-          <w:sz w:val="22"/>
-          <w:szCs w:val="22"/>
-        </w:rPr>
-      </w:pPr>
-    </w:p>
-    <w:p>
-      <w:pPr>
-        <w:spacing w:after="0"/>
-        <w:rPr>
-          <w:rFonts w:ascii="Calibri" w:hAnsi="Calibri" w:cs="Calibri"/>
-          <w:sz w:val="22"/>
-          <w:szCs w:val="22"/>
-        </w:rPr>
-      </w:pPr>
-      <w:r>
-        <w:rPr>
-          <w:rFonts w:ascii="Calibri" w:hAnsi="Calibri" w:cs="Calibri"/>
-          <w:sz w:val="22"/>
-          <w:szCs w:val="22"/>
-        </w:rPr>
-        <w:t xml:space="preserve">    /**</w:t>
-      </w:r>
-    </w:p>
-    <w:p>
-      <w:pPr>
-        <w:spacing w:after="0"/>
-        <w:rPr>
-          <w:rFonts w:ascii="Calibri" w:hAnsi="Calibri" w:cs="Calibri"/>
-          <w:sz w:val="22"/>
-          <w:szCs w:val="22"/>
-        </w:rPr>
-      </w:pPr>
-      <w:r>
-        <w:rPr>
-          <w:rFonts w:ascii="Calibri" w:hAnsi="Calibri" w:cs="Calibri"/>
-          <w:sz w:val="22"/>
-          <w:szCs w:val="22"/>
-        </w:rPr>
-        <w:t xml:space="preserve">     * </w:t>
-      </w:r>
-    </w:p>
-    <w:p>
-      <w:pPr>
-        <w:spacing w:after="0"/>
-        <w:rPr>
-          <w:rFonts w:ascii="Calibri" w:hAnsi="Calibri" w:cs="Calibri"/>
-          <w:sz w:val="22"/>
-          <w:szCs w:val="22"/>
-        </w:rPr>
-      </w:pPr>
-      <w:r>
-        <w:rPr>
-          <w:rFonts w:ascii="Calibri" w:hAnsi="Calibri" w:cs="Calibri"/>
-          <w:sz w:val="22"/>
-          <w:szCs w:val="22"/>
-        </w:rPr>
-        <w:t xml:space="preserve">     * @param sender</w:t>
-      </w:r>
-    </w:p>
-    <w:p>
-      <w:pPr>
-        <w:spacing w:after="0"/>
-        <w:rPr>
-          <w:rFonts w:ascii="Calibri" w:hAnsi="Calibri" w:cs="Calibri"/>
-          <w:sz w:val="22"/>
-          <w:szCs w:val="22"/>
-        </w:rPr>
-      </w:pPr>
-      <w:r>
-        <w:rPr>
-          <w:rFonts w:ascii="Calibri" w:hAnsi="Calibri" w:cs="Calibri"/>
-          <w:sz w:val="22"/>
-          <w:szCs w:val="22"/>
-        </w:rPr>
-        <w:t xml:space="preserve">     * @param receivers</w:t>
-      </w:r>
-    </w:p>
-    <w:p>
-      <w:pPr>
-        <w:spacing w:after="0"/>
-        <w:rPr>
-          <w:rFonts w:ascii="Calibri" w:hAnsi="Calibri" w:cs="Calibri"/>
-          <w:sz w:val="22"/>
-          <w:szCs w:val="22"/>
-        </w:rPr>
-      </w:pPr>
-      <w:r>
-        <w:rPr>
-          <w:rFonts w:ascii="Calibri" w:hAnsi="Calibri" w:cs="Calibri"/>
-          <w:sz w:val="22"/>
-          <w:szCs w:val="22"/>
-        </w:rPr>
-        <w:t xml:space="preserve">     * @param subject</w:t>
-      </w:r>
-    </w:p>
-    <w:p>
-      <w:pPr>
-        <w:spacing w:after="0"/>
-        <w:rPr>
-          <w:rFonts w:ascii="Calibri" w:hAnsi="Calibri" w:cs="Calibri"/>
-          <w:sz w:val="22"/>
-          <w:szCs w:val="22"/>
-        </w:rPr>
-      </w:pPr>
-      <w:r>
-        <w:rPr>
-          <w:rFonts w:ascii="Calibri" w:hAnsi="Calibri" w:cs="Calibri"/>
-          <w:sz w:val="22"/>
-          <w:szCs w:val="22"/>
-        </w:rPr>
-        <w:lastRenderedPageBreak/>
-        <w:t xml:space="preserve">     * @param body</w:t>
-      </w:r>
-    </w:p>
-    <w:p>
-      <w:pPr>
-        <w:spacing w:after="0"/>
-        <w:rPr>
-          <w:rFonts w:ascii="Calibri" w:hAnsi="Calibri" w:cs="Calibri"/>
-          <w:sz w:val="22"/>
-          <w:szCs w:val="22"/>
-        </w:rPr>
-      </w:pPr>
-      <w:r>
-        <w:rPr>
-          <w:rFonts w:ascii="Calibri" w:hAnsi="Calibri" w:cs="Calibri"/>
-          <w:sz w:val="22"/>
-          <w:szCs w:val="22"/>
-        </w:rPr>
-        <w:t xml:space="preserve">     */</w:t>
-      </w:r>
-    </w:p>
-    <w:p>
-      <w:pPr>
-        <w:spacing w:after="0"/>
-        <w:rPr>
-          <w:rFonts w:ascii="Calibri" w:hAnsi="Calibri" w:cs="Calibri"/>
-          <w:sz w:val="22"/>
-          <w:szCs w:val="22"/>
-        </w:rPr>
-      </w:pPr>
-      <w:r>
-        <w:rPr>
-          <w:rFonts w:ascii="Calibri" w:hAnsi="Calibri" w:cs="Calibri"/>
-          <w:sz w:val="22"/>
-          <w:szCs w:val="22"/>
-        </w:rPr>
-        <w:t xml:space="preserve">    public int sendEmail(String sender, String[] receivers, String subject, String body);</w:t>
-      </w:r>
-    </w:p>
-    <w:p>
-      <w:pPr>
-        <w:spacing w:after="0"/>
-        <w:rPr>
-          <w:rFonts w:ascii="Calibri" w:hAnsi="Calibri" w:cs="Calibri"/>
-          <w:sz w:val="22"/>
-          <w:szCs w:val="22"/>
-        </w:rPr>
-      </w:pPr>
-    </w:p>
-    <w:p>
-      <w:pPr>
-        <w:spacing w:after="0"/>
-        <w:rPr>
-          <w:rFonts w:ascii="Calibri" w:hAnsi="Calibri" w:cs="Calibri"/>
-          <w:sz w:val="22"/>
-          <w:szCs w:val="22"/>
-        </w:rPr>
-      </w:pPr>
-      <w:r>
-        <w:rPr>
-          <w:rFonts w:ascii="Calibri" w:hAnsi="Calibri" w:cs="Calibri"/>
-          <w:sz w:val="22"/>
-          <w:szCs w:val="22"/>
-        </w:rPr>
-        <w:t xml:space="preserve">    /**</w:t>
-      </w:r>
-    </w:p>
-    <w:p>
-      <w:pPr>
-        <w:spacing w:after="0"/>
-        <w:rPr>
-          <w:rFonts w:ascii="Calibri" w:hAnsi="Calibri" w:cs="Calibri"/>
-          <w:sz w:val="22"/>
-          <w:szCs w:val="22"/>
-        </w:rPr>
-      </w:pPr>
-      <w:r>
-        <w:rPr>
-          <w:rFonts w:ascii="Calibri" w:hAnsi="Calibri" w:cs="Calibri"/>
-          <w:sz w:val="22"/>
-          <w:szCs w:val="22"/>
-        </w:rPr>
-        <w:t xml:space="preserve">     * </w:t>
-      </w:r>
-    </w:p>
-    <w:p>
-      <w:pPr>
-        <w:spacing w:after="0"/>
-        <w:rPr>
-          <w:rFonts w:ascii="Calibri" w:hAnsi="Calibri" w:cs="Calibri"/>
-          <w:sz w:val="22"/>
-          <w:szCs w:val="22"/>
-        </w:rPr>
-      </w:pPr>
-      <w:r>
-        <w:rPr>
-          <w:rFonts w:ascii="Calibri" w:hAnsi="Calibri" w:cs="Calibri"/>
-          <w:sz w:val="22"/>
-          <w:szCs w:val="22"/>
-        </w:rPr>
-        <w:t xml:space="preserve">     * @param currency</w:t>
-      </w:r>
-    </w:p>
-    <w:p>
-      <w:pPr>
-        <w:spacing w:after="0"/>
-        <w:rPr>
-          <w:rFonts w:ascii="Calibri" w:hAnsi="Calibri" w:cs="Calibri"/>
-          <w:sz w:val="22"/>
-          <w:szCs w:val="22"/>
-        </w:rPr>
-      </w:pPr>
-      <w:r>
-        <w:rPr>
-          <w:rFonts w:ascii="Calibri" w:hAnsi="Calibri" w:cs="Calibri"/>
-          <w:sz w:val="22"/>
-          <w:szCs w:val="22"/>
-        </w:rPr>
-        <w:t xml:space="preserve">     * @param amount</w:t>
-      </w:r>
-    </w:p>
-    <w:p>
-      <w:pPr>
-        <w:spacing w:after="0"/>
-        <w:rPr>
-          <w:rFonts w:ascii="Calibri" w:hAnsi="Calibri" w:cs="Calibri"/>
-          <w:sz w:val="22"/>
-          <w:szCs w:val="22"/>
-        </w:rPr>
-      </w:pPr>
-      <w:r>
-        <w:rPr>
-          <w:rFonts w:ascii="Calibri" w:hAnsi="Calibri" w:cs="Calibri"/>
-          <w:sz w:val="22"/>
-          <w:szCs w:val="22"/>
-        </w:rPr>
-        <w:t xml:space="preserve">     * @param cardDetails</w:t>
-      </w:r>
-    </w:p>
-    <w:p>
-      <w:pPr>
-        <w:spacing w:after="0"/>
-        <w:rPr>
-          <w:rFonts w:ascii="Calibri" w:hAnsi="Calibri" w:cs="Calibri"/>
-          <w:sz w:val="22"/>
-          <w:szCs w:val="22"/>
-        </w:rPr>
-      </w:pPr>
-      <w:r>
-        <w:rPr>
-          <w:rFonts w:ascii="Calibri" w:hAnsi="Calibri" w:cs="Calibri"/>
-          <w:sz w:val="22"/>
-          <w:szCs w:val="22"/>
-        </w:rPr>
-        <w:t xml:space="preserve">     */</w:t>
-      </w:r>
-    </w:p>
-    <w:p>
-      <w:pPr>
-        <w:spacing w:after="0"/>
-        <w:rPr>
-          <w:rFonts w:ascii="Calibri" w:hAnsi="Calibri" w:cs="Calibri"/>
-          <w:sz w:val="22"/>
-          <w:szCs w:val="22"/>
-        </w:rPr>
-      </w:pPr>
-      <w:r>
-        <w:rPr>
-          <w:rFonts w:ascii="Calibri" w:hAnsi="Calibri" w:cs="Calibri"/>
-          <w:sz w:val="22"/>
-          <w:szCs w:val="22"/>
-        </w:rPr>
-        <w:t xml:space="preserve">    public int processPayment(char currency, float amount, Card cardDetails);</w:t>
-      </w:r>
-    </w:p>
-    <w:p>
-      <w:pPr>
-        <w:spacing w:after="0"/>
-        <w:rPr>
-          <w:rFonts w:ascii="Calibri" w:hAnsi="Calibri" w:cs="Calibri"/>
-          <w:sz w:val="22"/>
-          <w:szCs w:val="22"/>
-        </w:rPr>
-      </w:pPr>
-    </w:p>
-    <w:p>
-      <w:pPr>
-        <w:spacing w:after="0"/>
-        <w:rPr>
-          <w:rFonts w:ascii="Calibri" w:hAnsi="Calibri" w:cs="Calibri"/>
-          <w:sz w:val="22"/>
-          <w:szCs w:val="22"/>
-        </w:rPr>
-      </w:pPr>
-      <w:r>
-        <w:rPr>
-          <w:rFonts w:ascii="Calibri" w:hAnsi="Calibri" w:cs="Calibri"/>
-          <w:sz w:val="22"/>
-          <w:szCs w:val="22"/>
-        </w:rPr>
-        <w:t xml:space="preserve">    /**</w:t>
-      </w:r>
-    </w:p>
-    <w:p>
-      <w:pPr>
-        <w:spacing w:after="0"/>
-        <w:rPr>
-          <w:rFonts w:ascii="Calibri" w:hAnsi="Calibri" w:cs="Calibri"/>
-          <w:sz w:val="22"/>
-          <w:szCs w:val="22"/>
-        </w:rPr>
-      </w:pPr>
-      <w:r>
-        <w:rPr>
-          <w:rFonts w:ascii="Calibri" w:hAnsi="Calibri" w:cs="Calibri"/>
-          <w:sz w:val="22"/>
-          <w:szCs w:val="22"/>
-        </w:rPr>
-        <w:t xml:space="preserve">     * </w:t>
-      </w:r>
-    </w:p>
-    <w:p>
-      <w:pPr>
-        <w:spacing w:after="0"/>
-        <w:rPr>
-          <w:rFonts w:ascii="Calibri" w:hAnsi="Calibri" w:cs="Calibri"/>
-          <w:sz w:val="22"/>
-          <w:szCs w:val="22"/>
-        </w:rPr>
-      </w:pPr>
-      <w:r>
-        <w:rPr>
-          <w:rFonts w:ascii="Calibri" w:hAnsi="Calibri" w:cs="Calibri"/>
-          <w:sz w:val="22"/>
-          <w:szCs w:val="22"/>
-        </w:rPr>
-        <w:t xml:space="preserve">     * @param orderID</w:t>
-      </w:r>
-    </w:p>
-    <w:p>
-      <w:pPr>
-        <w:spacing w:after="0"/>
-        <w:rPr>
-          <w:rFonts w:ascii="Calibri" w:hAnsi="Calibri" w:cs="Calibri"/>
-          <w:sz w:val="22"/>
-          <w:szCs w:val="22"/>
-        </w:rPr>
-      </w:pPr>
-      <w:r>
-        <w:rPr>
-          <w:rFonts w:ascii="Calibri" w:hAnsi="Calibri" w:cs="Calibri"/>
-          <w:sz w:val="22"/>
-          <w:szCs w:val="22"/>
-        </w:rPr>
-        <w:t xml:space="preserve">     * @param newStatus</w:t>
-      </w:r>
-    </w:p>
-    <w:p>
-      <w:pPr>
-        <w:spacing w:after="0"/>
-        <w:rPr>
-          <w:rFonts w:ascii="Calibri" w:hAnsi="Calibri" w:cs="Calibri"/>
-          <w:sz w:val="22"/>
-          <w:szCs w:val="22"/>
-        </w:rPr>
-      </w:pPr>
-      <w:r>
-        <w:rPr>
-          <w:rFonts w:ascii="Calibri" w:hAnsi="Calibri" w:cs="Calibri"/>
-          <w:sz w:val="22"/>
-          <w:szCs w:val="22"/>
-        </w:rPr>
-        <w:t xml:space="preserve">     */</w:t>
-      </w:r>
-    </w:p>
-    <w:p>
-      <w:pPr>
-        <w:spacing w:after="0"/>
-        <w:rPr>
-          <w:rFonts w:ascii="Calibri" w:hAnsi="Calibri" w:cs="Calibri"/>
-          <w:sz w:val="22"/>
-          <w:szCs w:val="22"/>
-        </w:rPr>
-      </w:pPr>
-      <w:r>
-        <w:rPr>
-          <w:rFonts w:ascii="Calibri" w:hAnsi="Calibri" w:cs="Calibri"/>
-          <w:sz w:val="22"/>
-          <w:szCs w:val="22"/>
-        </w:rPr>
-        <w:t xml:space="preserve">    public int updateOrderStatus(int orderID, String newStatus);</w:t>
+        <w:t>/**</w:t>
       </w:r>
     </w:p>
     <w:p>
@@ -2847,6 +2993,237 @@
           <w:sz w:val="22"/>
           <w:szCs w:val="22"/>
         </w:rPr>
+        <w:t xml:space="preserve"> * Sends an email notification via the IPOS-PU subsystem.</w:t>
+      </w:r>
+    </w:p>
+    <w:p>
+      <w:pPr>
+        <w:pBdr>
+          <w:bottom w:val="single" w:sz="6" w:space="1" w:color="auto"/>
+        </w:pBdr>
+        <w:spacing w:after="0"/>
+        <w:rPr>
+          <w:rFonts w:ascii="Calibri" w:hAnsi="Calibri" w:cs="Calibri"/>
+          <w:sz w:val="22"/>
+          <w:szCs w:val="22"/>
+        </w:rPr>
+      </w:pPr>
+      <w:r>
+        <w:rPr>
+          <w:rFonts w:ascii="Calibri" w:hAnsi="Calibri" w:cs="Calibri"/>
+          <w:sz w:val="22"/>
+          <w:szCs w:val="22"/>
+        </w:rPr>
+        <w:t xml:space="preserve"> *</w:t>
+      </w:r>
+    </w:p>
+    <w:p>
+      <w:pPr>
+        <w:pBdr>
+          <w:bottom w:val="single" w:sz="6" w:space="1" w:color="auto"/>
+        </w:pBdr>
+        <w:spacing w:after="0"/>
+        <w:rPr>
+          <w:rFonts w:ascii="Calibri" w:hAnsi="Calibri" w:cs="Calibri"/>
+          <w:sz w:val="22"/>
+          <w:szCs w:val="22"/>
+        </w:rPr>
+      </w:pPr>
+      <w:r>
+        <w:rPr>
+          <w:rFonts w:ascii="Calibri" w:hAnsi="Calibri" w:cs="Calibri"/>
+          <w:sz w:val="22"/>
+          <w:szCs w:val="22"/>
+        </w:rPr>
+        <w:t xml:space="preserve"> * @param sender the email address of the sender.</w:t>
+      </w:r>
+    </w:p>
+    <w:p>
+      <w:pPr>
+        <w:pBdr>
+          <w:bottom w:val="single" w:sz="6" w:space="1" w:color="auto"/>
+        </w:pBdr>
+        <w:spacing w:after="0"/>
+        <w:rPr>
+          <w:rFonts w:ascii="Calibri" w:hAnsi="Calibri" w:cs="Calibri"/>
+          <w:sz w:val="22"/>
+          <w:szCs w:val="22"/>
+        </w:rPr>
+      </w:pPr>
+      <w:r>
+        <w:rPr>
+          <w:rFonts w:ascii="Calibri" w:hAnsi="Calibri" w:cs="Calibri"/>
+          <w:sz w:val="22"/>
+          <w:szCs w:val="22"/>
+        </w:rPr>
+        <w:t xml:space="preserve"> * Constraint: must be a valid email format.</w:t>
+      </w:r>
+    </w:p>
+    <w:p>
+      <w:pPr>
+        <w:pBdr>
+          <w:bottom w:val="single" w:sz="6" w:space="1" w:color="auto"/>
+        </w:pBdr>
+        <w:spacing w:after="0"/>
+        <w:rPr>
+          <w:rFonts w:ascii="Calibri" w:hAnsi="Calibri" w:cs="Calibri"/>
+          <w:sz w:val="22"/>
+          <w:szCs w:val="22"/>
+        </w:rPr>
+      </w:pPr>
+      <w:r>
+        <w:rPr>
+          <w:rFonts w:ascii="Calibri" w:hAnsi="Calibri" w:cs="Calibri"/>
+          <w:sz w:val="22"/>
+          <w:szCs w:val="22"/>
+        </w:rPr>
+        <w:t xml:space="preserve"> * @param receivers the recipient email addresses.</w:t>
+      </w:r>
+    </w:p>
+    <w:p>
+      <w:pPr>
+        <w:pBdr>
+          <w:bottom w:val="single" w:sz="6" w:space="1" w:color="auto"/>
+        </w:pBdr>
+        <w:spacing w:after="0"/>
+        <w:rPr>
+          <w:rFonts w:ascii="Calibri" w:hAnsi="Calibri" w:cs="Calibri"/>
+          <w:sz w:val="22"/>
+          <w:szCs w:val="22"/>
+        </w:rPr>
+      </w:pPr>
+      <w:r>
+        <w:rPr>
+          <w:rFonts w:ascii="Calibri" w:hAnsi="Calibri" w:cs="Calibri"/>
+          <w:sz w:val="22"/>
+          <w:szCs w:val="22"/>
+        </w:rPr>
+        <w:t xml:space="preserve"> * Constraint: must not be null or empty.</w:t>
+      </w:r>
+    </w:p>
+    <w:p>
+      <w:pPr>
+        <w:pBdr>
+          <w:bottom w:val="single" w:sz="6" w:space="1" w:color="auto"/>
+        </w:pBdr>
+        <w:spacing w:after="0"/>
+        <w:rPr>
+          <w:rFonts w:ascii="Calibri" w:hAnsi="Calibri" w:cs="Calibri"/>
+          <w:sz w:val="22"/>
+          <w:szCs w:val="22"/>
+        </w:rPr>
+      </w:pPr>
+      <w:r>
+        <w:rPr>
+          <w:rFonts w:ascii="Calibri" w:hAnsi="Calibri" w:cs="Calibri"/>
+          <w:sz w:val="22"/>
+          <w:szCs w:val="22"/>
+        </w:rPr>
+        <w:t xml:space="preserve"> * @param subject the email subject line.</w:t>
+      </w:r>
+    </w:p>
+    <w:p>
+      <w:pPr>
+        <w:pBdr>
+          <w:bottom w:val="single" w:sz="6" w:space="1" w:color="auto"/>
+        </w:pBdr>
+        <w:spacing w:after="0"/>
+        <w:rPr>
+          <w:rFonts w:ascii="Calibri" w:hAnsi="Calibri" w:cs="Calibri"/>
+          <w:sz w:val="22"/>
+          <w:szCs w:val="22"/>
+        </w:rPr>
+      </w:pPr>
+      <w:r>
+        <w:rPr>
+          <w:rFonts w:ascii="Calibri" w:hAnsi="Calibri" w:cs="Calibri"/>
+          <w:sz w:val="22"/>
+          <w:szCs w:val="22"/>
+        </w:rPr>
+        <w:t xml:space="preserve"> * Constraint: must not be null.</w:t>
+      </w:r>
+    </w:p>
+    <w:p>
+      <w:pPr>
+        <w:pBdr>
+          <w:bottom w:val="single" w:sz="6" w:space="1" w:color="auto"/>
+        </w:pBdr>
+        <w:spacing w:after="0"/>
+        <w:rPr>
+          <w:rFonts w:ascii="Calibri" w:hAnsi="Calibri" w:cs="Calibri"/>
+          <w:sz w:val="22"/>
+          <w:szCs w:val="22"/>
+        </w:rPr>
+      </w:pPr>
+      <w:r>
+        <w:rPr>
+          <w:rFonts w:ascii="Calibri" w:hAnsi="Calibri" w:cs="Calibri"/>
+          <w:sz w:val="22"/>
+          <w:szCs w:val="22"/>
+        </w:rPr>
+        <w:t xml:space="preserve"> * @param body the content of the email.</w:t>
+      </w:r>
+    </w:p>
+    <w:p>
+      <w:pPr>
+        <w:pBdr>
+          <w:bottom w:val="single" w:sz="6" w:space="1" w:color="auto"/>
+        </w:pBdr>
+        <w:spacing w:after="0"/>
+        <w:rPr>
+          <w:rFonts w:ascii="Calibri" w:hAnsi="Calibri" w:cs="Calibri"/>
+          <w:sz w:val="22"/>
+          <w:szCs w:val="22"/>
+        </w:rPr>
+      </w:pPr>
+      <w:r>
+        <w:rPr>
+          <w:rFonts w:ascii="Calibri" w:hAnsi="Calibri" w:cs="Calibri"/>
+          <w:sz w:val="22"/>
+          <w:szCs w:val="22"/>
+        </w:rPr>
+        <w:t xml:space="preserve"> * Constraint: must not be null.</w:t>
+      </w:r>
+    </w:p>
+    <w:p>
+      <w:pPr>
+        <w:pBdr>
+          <w:bottom w:val="single" w:sz="6" w:space="1" w:color="auto"/>
+        </w:pBdr>
+        <w:spacing w:after="0"/>
+        <w:rPr>
+          <w:rFonts w:ascii="Calibri" w:hAnsi="Calibri" w:cs="Calibri"/>
+          <w:sz w:val="22"/>
+          <w:szCs w:val="22"/>
+        </w:rPr>
+      </w:pPr>
+      <w:r>
+        <w:rPr>
+          <w:rFonts w:ascii="Calibri" w:hAnsi="Calibri" w:cs="Calibri"/>
+          <w:sz w:val="22"/>
+          <w:szCs w:val="22"/>
+        </w:rPr>
+        <w:t xml:space="preserve"> */</w:t>
+      </w:r>
+    </w:p>
+    <w:p>
+      <w:pPr>
+        <w:pBdr>
+          <w:bottom w:val="single" w:sz="6" w:space="1" w:color="auto"/>
+        </w:pBdr>
+        <w:spacing w:after="0"/>
+        <w:rPr>
+          <w:rFonts w:ascii="Calibri" w:hAnsi="Calibri" w:cs="Calibri"/>
+          <w:sz w:val="22"/>
+          <w:szCs w:val="22"/>
+        </w:rPr>
+      </w:pPr>
+      <w:r>
+        <w:rPr>
+          <w:rFonts w:ascii="Calibri" w:hAnsi="Calibri" w:cs="Calibri"/>
+          <w:sz w:val="22"/>
+          <w:szCs w:val="22"/>
+        </w:rPr>
         <w:t>}</w:t>
       </w:r>
     </w:p>
@@ -2862,6 +3239,762 @@
     </w:p>
     <w:p>
       <w:pPr>
+        <w:pBdr>
+          <w:bottom w:val="single" w:sz="6" w:space="1" w:color="auto"/>
+        </w:pBdr>
+        <w:spacing w:after="0"/>
+        <w:rPr>
+          <w:rFonts w:ascii="Calibri" w:hAnsi="Calibri" w:cs="Calibri"/>
+          <w:sz w:val="22"/>
+          <w:szCs w:val="22"/>
+        </w:rPr>
+      </w:pPr>
+      <w:r>
+        <w:rPr>
+          <w:rFonts w:ascii="Calibri" w:hAnsi="Calibri" w:cs="Calibri"/>
+          <w:sz w:val="22"/>
+          <w:szCs w:val="22"/>
+        </w:rPr>
+        <w:t>public interface I_IPOS_PU {</w:t>
+      </w:r>
+    </w:p>
+    <w:p>
+      <w:pPr>
+        <w:pBdr>
+          <w:bottom w:val="single" w:sz="6" w:space="1" w:color="auto"/>
+        </w:pBdr>
+        <w:spacing w:after="0"/>
+        <w:rPr>
+          <w:rFonts w:ascii="Calibri" w:hAnsi="Calibri" w:cs="Calibri"/>
+          <w:sz w:val="22"/>
+          <w:szCs w:val="22"/>
+        </w:rPr>
+      </w:pPr>
+    </w:p>
+    <w:p>
+      <w:pPr>
+        <w:pBdr>
+          <w:bottom w:val="single" w:sz="6" w:space="1" w:color="auto"/>
+        </w:pBdr>
+        <w:spacing w:after="0"/>
+        <w:rPr>
+          <w:rFonts w:ascii="Calibri" w:hAnsi="Calibri" w:cs="Calibri"/>
+          <w:sz w:val="22"/>
+          <w:szCs w:val="22"/>
+        </w:rPr>
+      </w:pPr>
+      <w:r>
+        <w:rPr>
+          <w:rFonts w:ascii="Calibri" w:hAnsi="Calibri" w:cs="Calibri"/>
+          <w:sz w:val="22"/>
+          <w:szCs w:val="22"/>
+        </w:rPr>
+        <w:t xml:space="preserve">public int </w:t>
+      </w:r>
+      <w:proofErr w:type="spellStart"/>
+      <w:proofErr w:type="gramStart"/>
+      <w:r>
+        <w:rPr>
+          <w:rFonts w:ascii="Calibri" w:hAnsi="Calibri" w:cs="Calibri"/>
+          <w:sz w:val="22"/>
+          <w:szCs w:val="22"/>
+        </w:rPr>
+        <w:t>sendEmail</w:t>
+      </w:r>
+      <w:proofErr w:type="spellEnd"/>
+      <w:r>
+        <w:rPr>
+          <w:rFonts w:ascii="Calibri" w:hAnsi="Calibri" w:cs="Calibri"/>
+          <w:sz w:val="22"/>
+          <w:szCs w:val="22"/>
+        </w:rPr>
+        <w:t>(</w:t>
+      </w:r>
+      <w:proofErr w:type="gramEnd"/>
+      <w:r>
+        <w:rPr>
+          <w:rFonts w:ascii="Calibri" w:hAnsi="Calibri" w:cs="Calibri"/>
+          <w:sz w:val="22"/>
+          <w:szCs w:val="22"/>
+        </w:rPr>
+        <w:t xml:space="preserve">String sender, </w:t>
+      </w:r>
+      <w:proofErr w:type="gramStart"/>
+      <w:r>
+        <w:rPr>
+          <w:rFonts w:ascii="Calibri" w:hAnsi="Calibri" w:cs="Calibri"/>
+          <w:sz w:val="22"/>
+          <w:szCs w:val="22"/>
+        </w:rPr>
+        <w:t>String[</w:t>
+      </w:r>
+      <w:proofErr w:type="gramEnd"/>
+      <w:r>
+        <w:rPr>
+          <w:rFonts w:ascii="Calibri" w:hAnsi="Calibri" w:cs="Calibri"/>
+          <w:sz w:val="22"/>
+          <w:szCs w:val="22"/>
+        </w:rPr>
+        <w:t>] receivers, String subject, String body</w:t>
+      </w:r>
+      <w:proofErr w:type="gramStart"/>
+      <w:r>
+        <w:rPr>
+          <w:rFonts w:ascii="Calibri" w:hAnsi="Calibri" w:cs="Calibri"/>
+          <w:sz w:val="22"/>
+          <w:szCs w:val="22"/>
+        </w:rPr>
+        <w:t>);</w:t>
+      </w:r>
+      <w:proofErr w:type="gramEnd"/>
+    </w:p>
+    <w:p>
+      <w:pPr>
+        <w:pBdr>
+          <w:bottom w:val="single" w:sz="6" w:space="1" w:color="auto"/>
+        </w:pBdr>
+        <w:spacing w:after="0"/>
+        <w:rPr>
+          <w:rFonts w:ascii="Calibri" w:hAnsi="Calibri" w:cs="Calibri"/>
+          <w:sz w:val="22"/>
+          <w:szCs w:val="22"/>
+        </w:rPr>
+      </w:pPr>
+      <w:r>
+        <w:rPr>
+          <w:rFonts w:ascii="Calibri" w:hAnsi="Calibri" w:cs="Calibri"/>
+          <w:sz w:val="22"/>
+          <w:szCs w:val="22"/>
+        </w:rPr>
+        <w:t>/**</w:t>
+      </w:r>
+    </w:p>
+    <w:p>
+      <w:pPr>
+        <w:pBdr>
+          <w:bottom w:val="single" w:sz="6" w:space="1" w:color="auto"/>
+        </w:pBdr>
+        <w:spacing w:after="0"/>
+        <w:rPr>
+          <w:rFonts w:ascii="Calibri" w:hAnsi="Calibri" w:cs="Calibri"/>
+          <w:sz w:val="22"/>
+          <w:szCs w:val="22"/>
+        </w:rPr>
+      </w:pPr>
+      <w:r>
+        <w:rPr>
+          <w:rFonts w:ascii="Calibri" w:hAnsi="Calibri" w:cs="Calibri"/>
+          <w:sz w:val="22"/>
+          <w:szCs w:val="22"/>
+        </w:rPr>
+        <w:t xml:space="preserve"> * Processes a payment request through the payment service.</w:t>
+      </w:r>
+    </w:p>
+    <w:p>
+      <w:pPr>
+        <w:pBdr>
+          <w:bottom w:val="single" w:sz="6" w:space="1" w:color="auto"/>
+        </w:pBdr>
+        <w:spacing w:after="0"/>
+        <w:rPr>
+          <w:rFonts w:ascii="Calibri" w:hAnsi="Calibri" w:cs="Calibri"/>
+          <w:sz w:val="22"/>
+          <w:szCs w:val="22"/>
+        </w:rPr>
+      </w:pPr>
+      <w:r>
+        <w:rPr>
+          <w:rFonts w:ascii="Calibri" w:hAnsi="Calibri" w:cs="Calibri"/>
+          <w:sz w:val="22"/>
+          <w:szCs w:val="22"/>
+        </w:rPr>
+        <w:t xml:space="preserve"> *</w:t>
+      </w:r>
+    </w:p>
+    <w:p>
+      <w:pPr>
+        <w:pBdr>
+          <w:bottom w:val="single" w:sz="6" w:space="1" w:color="auto"/>
+        </w:pBdr>
+        <w:spacing w:after="0"/>
+        <w:rPr>
+          <w:rFonts w:ascii="Calibri" w:hAnsi="Calibri" w:cs="Calibri"/>
+          <w:sz w:val="22"/>
+          <w:szCs w:val="22"/>
+        </w:rPr>
+      </w:pPr>
+      <w:r>
+        <w:rPr>
+          <w:rFonts w:ascii="Calibri" w:hAnsi="Calibri" w:cs="Calibri"/>
+          <w:sz w:val="22"/>
+          <w:szCs w:val="22"/>
+        </w:rPr>
+        <w:t xml:space="preserve"> * @param currency the currency indicator used for the transaction.</w:t>
+      </w:r>
+    </w:p>
+    <w:p>
+      <w:pPr>
+        <w:pBdr>
+          <w:bottom w:val="single" w:sz="6" w:space="1" w:color="auto"/>
+        </w:pBdr>
+        <w:spacing w:after="0"/>
+        <w:rPr>
+          <w:rFonts w:ascii="Calibri" w:hAnsi="Calibri" w:cs="Calibri"/>
+          <w:sz w:val="22"/>
+          <w:szCs w:val="22"/>
+        </w:rPr>
+      </w:pPr>
+      <w:r>
+        <w:rPr>
+          <w:rFonts w:ascii="Calibri" w:hAnsi="Calibri" w:cs="Calibri"/>
+          <w:sz w:val="22"/>
+          <w:szCs w:val="22"/>
+        </w:rPr>
+        <w:t xml:space="preserve"> * Constraint: must be a supported currency.</w:t>
+      </w:r>
+    </w:p>
+    <w:p>
+      <w:pPr>
+        <w:pBdr>
+          <w:bottom w:val="single" w:sz="6" w:space="1" w:color="auto"/>
+        </w:pBdr>
+        <w:spacing w:after="0"/>
+        <w:rPr>
+          <w:rFonts w:ascii="Calibri" w:hAnsi="Calibri" w:cs="Calibri"/>
+          <w:sz w:val="22"/>
+          <w:szCs w:val="22"/>
+        </w:rPr>
+      </w:pPr>
+      <w:r>
+        <w:rPr>
+          <w:rFonts w:ascii="Calibri" w:hAnsi="Calibri" w:cs="Calibri"/>
+          <w:sz w:val="22"/>
+          <w:szCs w:val="22"/>
+        </w:rPr>
+        <w:t xml:space="preserve"> * @param amount the amount to charge.</w:t>
+      </w:r>
+    </w:p>
+    <w:p>
+      <w:pPr>
+        <w:pBdr>
+          <w:bottom w:val="single" w:sz="6" w:space="1" w:color="auto"/>
+        </w:pBdr>
+        <w:spacing w:after="0"/>
+        <w:rPr>
+          <w:rFonts w:ascii="Calibri" w:hAnsi="Calibri" w:cs="Calibri"/>
+          <w:sz w:val="22"/>
+          <w:szCs w:val="22"/>
+        </w:rPr>
+      </w:pPr>
+      <w:r>
+        <w:rPr>
+          <w:rFonts w:ascii="Calibri" w:hAnsi="Calibri" w:cs="Calibri"/>
+          <w:sz w:val="22"/>
+          <w:szCs w:val="22"/>
+        </w:rPr>
+        <w:t xml:space="preserve"> * Constraint: must be greater than 0.</w:t>
+      </w:r>
+    </w:p>
+    <w:p>
+      <w:pPr>
+        <w:pBdr>
+          <w:bottom w:val="single" w:sz="6" w:space="1" w:color="auto"/>
+        </w:pBdr>
+        <w:spacing w:after="0"/>
+        <w:rPr>
+          <w:rFonts w:ascii="Calibri" w:hAnsi="Calibri" w:cs="Calibri"/>
+          <w:sz w:val="22"/>
+          <w:szCs w:val="22"/>
+        </w:rPr>
+      </w:pPr>
+      <w:r>
+        <w:rPr>
+          <w:rFonts w:ascii="Calibri" w:hAnsi="Calibri" w:cs="Calibri"/>
+          <w:sz w:val="22"/>
+          <w:szCs w:val="22"/>
+        </w:rPr>
+        <w:t xml:space="preserve"> * @param </w:t>
+      </w:r>
+      <w:proofErr w:type="spellStart"/>
+      <w:r>
+        <w:rPr>
+          <w:rFonts w:ascii="Calibri" w:hAnsi="Calibri" w:cs="Calibri"/>
+          <w:sz w:val="22"/>
+          <w:szCs w:val="22"/>
+        </w:rPr>
+        <w:t>cardDetails</w:t>
+      </w:r>
+      <w:proofErr w:type="spellEnd"/>
+      <w:r>
+        <w:rPr>
+          <w:rFonts w:ascii="Calibri" w:hAnsi="Calibri" w:cs="Calibri"/>
+          <w:sz w:val="22"/>
+          <w:szCs w:val="22"/>
+        </w:rPr>
+        <w:t xml:space="preserve"> the card information required for authorisation.</w:t>
+      </w:r>
+    </w:p>
+    <w:p>
+      <w:pPr>
+        <w:pBdr>
+          <w:bottom w:val="single" w:sz="6" w:space="1" w:color="auto"/>
+        </w:pBdr>
+        <w:spacing w:after="0"/>
+        <w:rPr>
+          <w:rFonts w:ascii="Calibri" w:hAnsi="Calibri" w:cs="Calibri"/>
+          <w:sz w:val="22"/>
+          <w:szCs w:val="22"/>
+        </w:rPr>
+      </w:pPr>
+      <w:r>
+        <w:rPr>
+          <w:rFonts w:ascii="Calibri" w:hAnsi="Calibri" w:cs="Calibri"/>
+          <w:sz w:val="22"/>
+          <w:szCs w:val="22"/>
+        </w:rPr>
+        <w:t xml:space="preserve"> * Constraint: must not be null; must contain valid card information.</w:t>
+      </w:r>
+    </w:p>
+    <w:p>
+      <w:pPr>
+        <w:pBdr>
+          <w:bottom w:val="single" w:sz="6" w:space="1" w:color="auto"/>
+        </w:pBdr>
+        <w:spacing w:after="0"/>
+        <w:rPr>
+          <w:rFonts w:ascii="Calibri" w:hAnsi="Calibri" w:cs="Calibri"/>
+          <w:sz w:val="22"/>
+          <w:szCs w:val="22"/>
+        </w:rPr>
+      </w:pPr>
+      <w:r>
+        <w:rPr>
+          <w:rFonts w:ascii="Calibri" w:hAnsi="Calibri" w:cs="Calibri"/>
+          <w:sz w:val="22"/>
+          <w:szCs w:val="22"/>
+        </w:rPr>
+        <w:t xml:space="preserve"> */</w:t>
+      </w:r>
+    </w:p>
+    <w:p>
+      <w:pPr>
+        <w:pBdr>
+          <w:bottom w:val="single" w:sz="6" w:space="1" w:color="auto"/>
+        </w:pBdr>
+        <w:spacing w:after="0"/>
+        <w:rPr>
+          <w:rFonts w:ascii="Calibri" w:hAnsi="Calibri" w:cs="Calibri"/>
+          <w:sz w:val="22"/>
+          <w:szCs w:val="22"/>
+        </w:rPr>
+      </w:pPr>
+    </w:p>
+    <w:p>
+      <w:pPr>
+        <w:pBdr>
+          <w:bottom w:val="single" w:sz="6" w:space="1" w:color="auto"/>
+        </w:pBdr>
+        <w:spacing w:after="0"/>
+        <w:rPr>
+          <w:rFonts w:ascii="Calibri" w:hAnsi="Calibri" w:cs="Calibri"/>
+          <w:sz w:val="22"/>
+          <w:szCs w:val="22"/>
+        </w:rPr>
+      </w:pPr>
+      <w:r>
+        <w:rPr>
+          <w:rFonts w:ascii="Calibri" w:hAnsi="Calibri" w:cs="Calibri"/>
+          <w:sz w:val="22"/>
+          <w:szCs w:val="22"/>
+        </w:rPr>
+        <w:t xml:space="preserve">public int </w:t>
+      </w:r>
+      <w:proofErr w:type="spellStart"/>
+      <w:proofErr w:type="gramStart"/>
+      <w:r>
+        <w:rPr>
+          <w:rFonts w:ascii="Calibri" w:hAnsi="Calibri" w:cs="Calibri"/>
+          <w:sz w:val="22"/>
+          <w:szCs w:val="22"/>
+        </w:rPr>
+        <w:t>processPayment</w:t>
+      </w:r>
+      <w:proofErr w:type="spellEnd"/>
+      <w:r>
+        <w:rPr>
+          <w:rFonts w:ascii="Calibri" w:hAnsi="Calibri" w:cs="Calibri"/>
+          <w:sz w:val="22"/>
+          <w:szCs w:val="22"/>
+        </w:rPr>
+        <w:t>(</w:t>
+      </w:r>
+      <w:proofErr w:type="gramEnd"/>
+      <w:r>
+        <w:rPr>
+          <w:rFonts w:ascii="Calibri" w:hAnsi="Calibri" w:cs="Calibri"/>
+          <w:sz w:val="22"/>
+          <w:szCs w:val="22"/>
+        </w:rPr>
+        <w:t xml:space="preserve">char currency, float amount, Card </w:t>
+      </w:r>
+      <w:proofErr w:type="spellStart"/>
+      <w:r>
+        <w:rPr>
+          <w:rFonts w:ascii="Calibri" w:hAnsi="Calibri" w:cs="Calibri"/>
+          <w:sz w:val="22"/>
+          <w:szCs w:val="22"/>
+        </w:rPr>
+        <w:t>cardDetails</w:t>
+      </w:r>
+      <w:proofErr w:type="spellEnd"/>
+      <w:proofErr w:type="gramStart"/>
+      <w:r>
+        <w:rPr>
+          <w:rFonts w:ascii="Calibri" w:hAnsi="Calibri" w:cs="Calibri"/>
+          <w:sz w:val="22"/>
+          <w:szCs w:val="22"/>
+        </w:rPr>
+        <w:t>);</w:t>
+      </w:r>
+      <w:proofErr w:type="gramEnd"/>
+    </w:p>
+    <w:p>
+      <w:pPr>
+        <w:pBdr>
+          <w:bottom w:val="single" w:sz="6" w:space="1" w:color="auto"/>
+        </w:pBdr>
+        <w:spacing w:after="0"/>
+        <w:rPr>
+          <w:rFonts w:ascii="Calibri" w:hAnsi="Calibri" w:cs="Calibri"/>
+          <w:sz w:val="22"/>
+          <w:szCs w:val="22"/>
+        </w:rPr>
+      </w:pPr>
+      <w:r>
+        <w:rPr>
+          <w:rFonts w:ascii="Calibri" w:hAnsi="Calibri" w:cs="Calibri"/>
+          <w:sz w:val="22"/>
+          <w:szCs w:val="22"/>
+        </w:rPr>
+        <w:t>/**</w:t>
+      </w:r>
+    </w:p>
+    <w:p>
+      <w:pPr>
+        <w:pBdr>
+          <w:bottom w:val="single" w:sz="6" w:space="1" w:color="auto"/>
+        </w:pBdr>
+        <w:spacing w:after="0"/>
+        <w:rPr>
+          <w:rFonts w:ascii="Calibri" w:hAnsi="Calibri" w:cs="Calibri"/>
+          <w:sz w:val="22"/>
+          <w:szCs w:val="22"/>
+        </w:rPr>
+      </w:pPr>
+      <w:r>
+        <w:rPr>
+          <w:rFonts w:ascii="Calibri" w:hAnsi="Calibri" w:cs="Calibri"/>
+          <w:sz w:val="22"/>
+          <w:szCs w:val="22"/>
+        </w:rPr>
+        <w:t xml:space="preserve"> * Updates the status of an order in the PU subsystem.</w:t>
+      </w:r>
+    </w:p>
+    <w:p>
+      <w:pPr>
+        <w:pBdr>
+          <w:bottom w:val="single" w:sz="6" w:space="1" w:color="auto"/>
+        </w:pBdr>
+        <w:spacing w:after="0"/>
+        <w:rPr>
+          <w:rFonts w:ascii="Calibri" w:hAnsi="Calibri" w:cs="Calibri"/>
+          <w:sz w:val="22"/>
+          <w:szCs w:val="22"/>
+        </w:rPr>
+      </w:pPr>
+      <w:r>
+        <w:rPr>
+          <w:rFonts w:ascii="Calibri" w:hAnsi="Calibri" w:cs="Calibri"/>
+          <w:sz w:val="22"/>
+          <w:szCs w:val="22"/>
+        </w:rPr>
+        <w:t xml:space="preserve"> *</w:t>
+      </w:r>
+    </w:p>
+    <w:p>
+      <w:pPr>
+        <w:pBdr>
+          <w:bottom w:val="single" w:sz="6" w:space="1" w:color="auto"/>
+        </w:pBdr>
+        <w:spacing w:after="0"/>
+        <w:rPr>
+          <w:rFonts w:ascii="Calibri" w:hAnsi="Calibri" w:cs="Calibri"/>
+          <w:sz w:val="22"/>
+          <w:szCs w:val="22"/>
+        </w:rPr>
+      </w:pPr>
+      <w:r>
+        <w:rPr>
+          <w:rFonts w:ascii="Calibri" w:hAnsi="Calibri" w:cs="Calibri"/>
+          <w:sz w:val="22"/>
+          <w:szCs w:val="22"/>
+        </w:rPr>
+        <w:t xml:space="preserve"> * @param </w:t>
+      </w:r>
+      <w:proofErr w:type="spellStart"/>
+      <w:r>
+        <w:rPr>
+          <w:rFonts w:ascii="Calibri" w:hAnsi="Calibri" w:cs="Calibri"/>
+          <w:sz w:val="22"/>
+          <w:szCs w:val="22"/>
+        </w:rPr>
+        <w:t>orderID</w:t>
+      </w:r>
+      <w:proofErr w:type="spellEnd"/>
+      <w:r>
+        <w:rPr>
+          <w:rFonts w:ascii="Calibri" w:hAnsi="Calibri" w:cs="Calibri"/>
+          <w:sz w:val="22"/>
+          <w:szCs w:val="22"/>
+        </w:rPr>
+        <w:t xml:space="preserve"> the identifier of the order.</w:t>
+      </w:r>
+    </w:p>
+    <w:p>
+      <w:pPr>
+        <w:pBdr>
+          <w:bottom w:val="single" w:sz="6" w:space="1" w:color="auto"/>
+        </w:pBdr>
+        <w:spacing w:after="0"/>
+        <w:rPr>
+          <w:rFonts w:ascii="Calibri" w:hAnsi="Calibri" w:cs="Calibri"/>
+          <w:sz w:val="22"/>
+          <w:szCs w:val="22"/>
+        </w:rPr>
+      </w:pPr>
+      <w:r>
+        <w:rPr>
+          <w:rFonts w:ascii="Calibri" w:hAnsi="Calibri" w:cs="Calibri"/>
+          <w:sz w:val="22"/>
+          <w:szCs w:val="22"/>
+        </w:rPr>
+        <w:t xml:space="preserve"> * Constraint: must refer to an existing order.</w:t>
+      </w:r>
+    </w:p>
+    <w:p>
+      <w:pPr>
+        <w:pBdr>
+          <w:bottom w:val="single" w:sz="6" w:space="1" w:color="auto"/>
+        </w:pBdr>
+        <w:spacing w:after="0"/>
+        <w:rPr>
+          <w:rFonts w:ascii="Calibri" w:hAnsi="Calibri" w:cs="Calibri"/>
+          <w:sz w:val="22"/>
+          <w:szCs w:val="22"/>
+        </w:rPr>
+      </w:pPr>
+      <w:r>
+        <w:rPr>
+          <w:rFonts w:ascii="Calibri" w:hAnsi="Calibri" w:cs="Calibri"/>
+          <w:sz w:val="22"/>
+          <w:szCs w:val="22"/>
+        </w:rPr>
+        <w:t xml:space="preserve"> * @param </w:t>
+      </w:r>
+      <w:proofErr w:type="spellStart"/>
+      <w:r>
+        <w:rPr>
+          <w:rFonts w:ascii="Calibri" w:hAnsi="Calibri" w:cs="Calibri"/>
+          <w:sz w:val="22"/>
+          <w:szCs w:val="22"/>
+        </w:rPr>
+        <w:t>newStatus</w:t>
+      </w:r>
+      <w:proofErr w:type="spellEnd"/>
+      <w:r>
+        <w:rPr>
+          <w:rFonts w:ascii="Calibri" w:hAnsi="Calibri" w:cs="Calibri"/>
+          <w:sz w:val="22"/>
+          <w:szCs w:val="22"/>
+        </w:rPr>
+        <w:t xml:space="preserve"> the new status value.</w:t>
+      </w:r>
+    </w:p>
+    <w:p>
+      <w:pPr>
+        <w:pBdr>
+          <w:bottom w:val="single" w:sz="6" w:space="1" w:color="auto"/>
+        </w:pBdr>
+        <w:spacing w:after="0"/>
+        <w:rPr>
+          <w:rFonts w:ascii="Calibri" w:hAnsi="Calibri" w:cs="Calibri"/>
+          <w:sz w:val="22"/>
+          <w:szCs w:val="22"/>
+        </w:rPr>
+      </w:pPr>
+      <w:r>
+        <w:rPr>
+          <w:rFonts w:ascii="Calibri" w:hAnsi="Calibri" w:cs="Calibri"/>
+          <w:sz w:val="22"/>
+          <w:szCs w:val="22"/>
+        </w:rPr>
+        <w:t xml:space="preserve"> * Constraint: must be a valid workflow status.</w:t>
+      </w:r>
+    </w:p>
+    <w:p>
+      <w:pPr>
+        <w:pBdr>
+          <w:bottom w:val="single" w:sz="6" w:space="1" w:color="auto"/>
+        </w:pBdr>
+        <w:spacing w:after="0"/>
+        <w:rPr>
+          <w:rFonts w:ascii="Calibri" w:hAnsi="Calibri" w:cs="Calibri"/>
+          <w:sz w:val="22"/>
+          <w:szCs w:val="22"/>
+        </w:rPr>
+      </w:pPr>
+      <w:r>
+        <w:rPr>
+          <w:rFonts w:ascii="Calibri" w:hAnsi="Calibri" w:cs="Calibri"/>
+          <w:sz w:val="22"/>
+          <w:szCs w:val="22"/>
+        </w:rPr>
+        <w:t xml:space="preserve"> */</w:t>
+      </w:r>
+    </w:p>
+    <w:p>
+      <w:pPr>
+        <w:pBdr>
+          <w:bottom w:val="single" w:sz="6" w:space="1" w:color="auto"/>
+        </w:pBdr>
+        <w:spacing w:after="0"/>
+        <w:rPr>
+          <w:rFonts w:ascii="Calibri" w:hAnsi="Calibri" w:cs="Calibri"/>
+          <w:sz w:val="22"/>
+          <w:szCs w:val="22"/>
+        </w:rPr>
+      </w:pPr>
+    </w:p>
+    <w:p>
+      <w:pPr>
+        <w:pBdr>
+          <w:bottom w:val="single" w:sz="6" w:space="1" w:color="auto"/>
+        </w:pBdr>
+        <w:spacing w:after="0"/>
+        <w:rPr>
+          <w:rFonts w:ascii="Calibri" w:hAnsi="Calibri" w:cs="Calibri"/>
+          <w:sz w:val="22"/>
+          <w:szCs w:val="22"/>
+        </w:rPr>
+      </w:pPr>
+      <w:r>
+        <w:rPr>
+          <w:rFonts w:ascii="Calibri" w:hAnsi="Calibri" w:cs="Calibri"/>
+          <w:sz w:val="22"/>
+          <w:szCs w:val="22"/>
+        </w:rPr>
+        <w:t xml:space="preserve">public int </w:t>
+      </w:r>
+      <w:proofErr w:type="spellStart"/>
+      <w:proofErr w:type="gramStart"/>
+      <w:r>
+        <w:rPr>
+          <w:rFonts w:ascii="Calibri" w:hAnsi="Calibri" w:cs="Calibri"/>
+          <w:sz w:val="22"/>
+          <w:szCs w:val="22"/>
+        </w:rPr>
+        <w:t>updateOrderStatus</w:t>
+      </w:r>
+      <w:proofErr w:type="spellEnd"/>
+      <w:r>
+        <w:rPr>
+          <w:rFonts w:ascii="Calibri" w:hAnsi="Calibri" w:cs="Calibri"/>
+          <w:sz w:val="22"/>
+          <w:szCs w:val="22"/>
+        </w:rPr>
+        <w:t>(</w:t>
+      </w:r>
+      <w:proofErr w:type="gramEnd"/>
+      <w:r>
+        <w:rPr>
+          <w:rFonts w:ascii="Calibri" w:hAnsi="Calibri" w:cs="Calibri"/>
+          <w:sz w:val="22"/>
+          <w:szCs w:val="22"/>
+        </w:rPr>
+        <w:t xml:space="preserve">int </w:t>
+      </w:r>
+      <w:proofErr w:type="spellStart"/>
+      <w:r>
+        <w:rPr>
+          <w:rFonts w:ascii="Calibri" w:hAnsi="Calibri" w:cs="Calibri"/>
+          <w:sz w:val="22"/>
+          <w:szCs w:val="22"/>
+        </w:rPr>
+        <w:t>orderID</w:t>
+      </w:r>
+      <w:proofErr w:type="spellEnd"/>
+      <w:r>
+        <w:rPr>
+          <w:rFonts w:ascii="Calibri" w:hAnsi="Calibri" w:cs="Calibri"/>
+          <w:sz w:val="22"/>
+          <w:szCs w:val="22"/>
+        </w:rPr>
+        <w:t xml:space="preserve">, String </w:t>
+      </w:r>
+      <w:proofErr w:type="spellStart"/>
+      <w:r>
+        <w:rPr>
+          <w:rFonts w:ascii="Calibri" w:hAnsi="Calibri" w:cs="Calibri"/>
+          <w:sz w:val="22"/>
+          <w:szCs w:val="22"/>
+        </w:rPr>
+        <w:t>newStatus</w:t>
+      </w:r>
+      <w:proofErr w:type="spellEnd"/>
+      <w:proofErr w:type="gramStart"/>
+      <w:r>
+        <w:rPr>
+          <w:rFonts w:ascii="Calibri" w:hAnsi="Calibri" w:cs="Calibri"/>
+          <w:sz w:val="22"/>
+          <w:szCs w:val="22"/>
+        </w:rPr>
+        <w:t>);</w:t>
+      </w:r>
+      <w:proofErr w:type="gramEnd"/>
+    </w:p>
+    <w:p>
+      <w:pPr>
+        <w:pBdr>
+          <w:bottom w:val="single" w:sz="6" w:space="1" w:color="auto"/>
+        </w:pBdr>
+        <w:spacing w:after="0"/>
+        <w:rPr>
+          <w:rFonts w:ascii="Calibri" w:hAnsi="Calibri" w:cs="Calibri"/>
+          <w:sz w:val="22"/>
+          <w:szCs w:val="22"/>
+        </w:rPr>
+      </w:pPr>
+      <w:r>
+        <w:rPr>
+          <w:rFonts w:ascii="Calibri" w:hAnsi="Calibri" w:cs="Calibri"/>
+          <w:sz w:val="22"/>
+          <w:szCs w:val="22"/>
+        </w:rPr>
+        <w:t>}</w:t>
+      </w:r>
+    </w:p>
+    <w:p>
+      <w:pPr>
+        <w:spacing w:after="0"/>
+        <w:rPr>
+          <w:rFonts w:ascii="Calibri" w:hAnsi="Calibri" w:cs="Calibri"/>
+          <w:sz w:val="22"/>
+          <w:szCs w:val="22"/>
+        </w:rPr>
+      </w:pPr>
+    </w:p>
+    <w:p>
+      <w:pPr>
         <w:spacing w:after="0"/>
         <w:rPr>
           <w:rFonts w:ascii="Calibri" w:hAnsi="Calibri" w:cs="Calibri"/>
@@ -2903,198 +4036,446 @@
           <w:sz w:val="22"/>
           <w:szCs w:val="22"/>
         </w:rPr>
-        <w:t xml:space="preserve">    /**</w:t>
-      </w:r>
-    </w:p>
-    <w:p>
-      <w:pPr>
-        <w:spacing w:after="0"/>
-        <w:rPr>
-          <w:rFonts w:ascii="Calibri" w:hAnsi="Calibri" w:cs="Calibri"/>
-          <w:sz w:val="22"/>
-          <w:szCs w:val="22"/>
-        </w:rPr>
-      </w:pPr>
-      <w:r>
-        <w:rPr>
-          <w:rFonts w:ascii="Calibri" w:hAnsi="Calibri" w:cs="Calibri"/>
-          <w:sz w:val="22"/>
-          <w:szCs w:val="22"/>
-        </w:rPr>
-        <w:t xml:space="preserve">     * </w:t>
-      </w:r>
-    </w:p>
-    <w:p>
-      <w:pPr>
-        <w:spacing w:after="0"/>
-        <w:rPr>
-          <w:rFonts w:ascii="Calibri" w:hAnsi="Calibri" w:cs="Calibri"/>
-          <w:sz w:val="22"/>
-          <w:szCs w:val="22"/>
-        </w:rPr>
-      </w:pPr>
-      <w:r>
-        <w:rPr>
-          <w:rFonts w:ascii="Calibri" w:hAnsi="Calibri" w:cs="Calibri"/>
-          <w:sz w:val="22"/>
-          <w:szCs w:val="22"/>
-        </w:rPr>
-        <w:t xml:space="preserve">     * @param productID</w:t>
-      </w:r>
-    </w:p>
-    <w:p>
-      <w:pPr>
-        <w:spacing w:after="0"/>
-        <w:rPr>
-          <w:rFonts w:ascii="Calibri" w:hAnsi="Calibri" w:cs="Calibri"/>
-          <w:sz w:val="22"/>
-          <w:szCs w:val="22"/>
-        </w:rPr>
-      </w:pPr>
-      <w:r>
-        <w:rPr>
-          <w:rFonts w:ascii="Calibri" w:hAnsi="Calibri" w:cs="Calibri"/>
-          <w:sz w:val="22"/>
-          <w:szCs w:val="22"/>
-        </w:rPr>
-        <w:t xml:space="preserve">     * @param amount</w:t>
-      </w:r>
-    </w:p>
-    <w:p>
-      <w:pPr>
-        <w:spacing w:after="0"/>
-        <w:rPr>
-          <w:rFonts w:ascii="Calibri" w:hAnsi="Calibri" w:cs="Calibri"/>
-          <w:sz w:val="22"/>
-          <w:szCs w:val="22"/>
-        </w:rPr>
-      </w:pPr>
-      <w:r>
-        <w:rPr>
-          <w:rFonts w:ascii="Calibri" w:hAnsi="Calibri" w:cs="Calibri"/>
-          <w:sz w:val="22"/>
-          <w:szCs w:val="22"/>
-        </w:rPr>
-        <w:t xml:space="preserve">     */</w:t>
-      </w:r>
-    </w:p>
-    <w:p>
-      <w:pPr>
-        <w:spacing w:after="0"/>
-        <w:rPr>
-          <w:rFonts w:ascii="Calibri" w:hAnsi="Calibri" w:cs="Calibri"/>
-          <w:sz w:val="22"/>
-          <w:szCs w:val="22"/>
-        </w:rPr>
-      </w:pPr>
-      <w:r>
-        <w:rPr>
-          <w:rFonts w:ascii="Calibri" w:hAnsi="Calibri" w:cs="Calibri"/>
-          <w:sz w:val="22"/>
-          <w:szCs w:val="22"/>
-        </w:rPr>
-        <w:t xml:space="preserve">    public void mutateStock(int productID, int amount);</w:t>
-      </w:r>
-    </w:p>
-    <w:p>
-      <w:pPr>
-        <w:spacing w:after="0"/>
-        <w:rPr>
-          <w:rFonts w:ascii="Calibri" w:hAnsi="Calibri" w:cs="Calibri"/>
-          <w:sz w:val="22"/>
-          <w:szCs w:val="22"/>
-        </w:rPr>
-      </w:pPr>
-    </w:p>
-    <w:p>
-      <w:pPr>
-        <w:spacing w:after="0"/>
-        <w:rPr>
-          <w:rFonts w:ascii="Calibri" w:hAnsi="Calibri" w:cs="Calibri"/>
-          <w:sz w:val="22"/>
-          <w:szCs w:val="22"/>
-        </w:rPr>
-      </w:pPr>
-      <w:r>
-        <w:rPr>
-          <w:rFonts w:ascii="Calibri" w:hAnsi="Calibri" w:cs="Calibri"/>
-          <w:sz w:val="22"/>
-          <w:szCs w:val="22"/>
-        </w:rPr>
-        <w:t xml:space="preserve">    /**</w:t>
-      </w:r>
-    </w:p>
-    <w:p>
-      <w:pPr>
-        <w:spacing w:after="0"/>
-        <w:rPr>
-          <w:rFonts w:ascii="Calibri" w:hAnsi="Calibri" w:cs="Calibri"/>
-          <w:sz w:val="22"/>
-          <w:szCs w:val="22"/>
-        </w:rPr>
-      </w:pPr>
-      <w:r>
-        <w:rPr>
-          <w:rFonts w:ascii="Calibri" w:hAnsi="Calibri" w:cs="Calibri"/>
-          <w:sz w:val="22"/>
-          <w:szCs w:val="22"/>
-        </w:rPr>
-        <w:t xml:space="preserve">     * </w:t>
-      </w:r>
-    </w:p>
-    <w:p>
-      <w:pPr>
-        <w:spacing w:after="0"/>
-        <w:rPr>
-          <w:rFonts w:ascii="Calibri" w:hAnsi="Calibri" w:cs="Calibri"/>
-          <w:sz w:val="22"/>
-          <w:szCs w:val="22"/>
-        </w:rPr>
-      </w:pPr>
-      <w:r>
-        <w:rPr>
-          <w:rFonts w:ascii="Calibri" w:hAnsi="Calibri" w:cs="Calibri"/>
-          <w:sz w:val="22"/>
-          <w:szCs w:val="22"/>
-        </w:rPr>
-        <w:t xml:space="preserve">     * @param productID</w:t>
-      </w:r>
-    </w:p>
-    <w:p>
-      <w:pPr>
-        <w:spacing w:after="0"/>
-        <w:rPr>
-          <w:rFonts w:ascii="Calibri" w:hAnsi="Calibri" w:cs="Calibri"/>
-          <w:sz w:val="22"/>
-          <w:szCs w:val="22"/>
-        </w:rPr>
-      </w:pPr>
-      <w:r>
-        <w:rPr>
-          <w:rFonts w:ascii="Calibri" w:hAnsi="Calibri" w:cs="Calibri"/>
-          <w:sz w:val="22"/>
-          <w:szCs w:val="22"/>
-        </w:rPr>
-        <w:t xml:space="preserve">     */</w:t>
-      </w:r>
-    </w:p>
-    <w:p>
-      <w:pPr>
-        <w:spacing w:after="0"/>
-        <w:rPr>
-          <w:rFonts w:ascii="Calibri" w:hAnsi="Calibri" w:cs="Calibri"/>
-          <w:sz w:val="22"/>
-          <w:szCs w:val="22"/>
-        </w:rPr>
-      </w:pPr>
-      <w:r>
-        <w:rPr>
-          <w:rFonts w:ascii="Calibri" w:hAnsi="Calibri" w:cs="Calibri"/>
-          <w:sz w:val="22"/>
-          <w:szCs w:val="22"/>
-        </w:rPr>
-        <w:t xml:space="preserve">    public int stockQuantity(int productID);</w:t>
-      </w:r>
+        <w:t>/**</w:t>
+      </w:r>
+    </w:p>
+    <w:p>
+      <w:pPr>
+        <w:spacing w:after="0"/>
+        <w:rPr>
+          <w:rFonts w:ascii="Calibri" w:hAnsi="Calibri" w:cs="Calibri"/>
+          <w:sz w:val="22"/>
+          <w:szCs w:val="22"/>
+        </w:rPr>
+      </w:pPr>
+      <w:r>
+        <w:rPr>
+          <w:rFonts w:ascii="Calibri" w:hAnsi="Calibri" w:cs="Calibri"/>
+          <w:sz w:val="22"/>
+          <w:szCs w:val="22"/>
+        </w:rPr>
+        <w:t xml:space="preserve"> * Adjusts the stock level of a product.</w:t>
+      </w:r>
+    </w:p>
+    <w:p>
+      <w:pPr>
+        <w:spacing w:after="0"/>
+        <w:rPr>
+          <w:rFonts w:ascii="Calibri" w:hAnsi="Calibri" w:cs="Calibri"/>
+          <w:sz w:val="22"/>
+          <w:szCs w:val="22"/>
+        </w:rPr>
+      </w:pPr>
+      <w:r>
+        <w:rPr>
+          <w:rFonts w:ascii="Calibri" w:hAnsi="Calibri" w:cs="Calibri"/>
+          <w:sz w:val="22"/>
+          <w:szCs w:val="22"/>
+        </w:rPr>
+        <w:t xml:space="preserve"> * Used when orders are completed or cancelled.</w:t>
+      </w:r>
+    </w:p>
+    <w:p>
+      <w:pPr>
+        <w:spacing w:after="0"/>
+        <w:rPr>
+          <w:rFonts w:ascii="Calibri" w:hAnsi="Calibri" w:cs="Calibri"/>
+          <w:sz w:val="22"/>
+          <w:szCs w:val="22"/>
+        </w:rPr>
+      </w:pPr>
+      <w:r>
+        <w:rPr>
+          <w:rFonts w:ascii="Calibri" w:hAnsi="Calibri" w:cs="Calibri"/>
+          <w:sz w:val="22"/>
+          <w:szCs w:val="22"/>
+        </w:rPr>
+        <w:t xml:space="preserve"> *</w:t>
+      </w:r>
+    </w:p>
+    <w:p>
+      <w:pPr>
+        <w:spacing w:after="0"/>
+        <w:rPr>
+          <w:rFonts w:ascii="Calibri" w:hAnsi="Calibri" w:cs="Calibri"/>
+          <w:sz w:val="22"/>
+          <w:szCs w:val="22"/>
+        </w:rPr>
+      </w:pPr>
+      <w:r>
+        <w:rPr>
+          <w:rFonts w:ascii="Calibri" w:hAnsi="Calibri" w:cs="Calibri"/>
+          <w:sz w:val="22"/>
+          <w:szCs w:val="22"/>
+        </w:rPr>
+        <w:t xml:space="preserve"> * @param </w:t>
+      </w:r>
+      <w:proofErr w:type="spellStart"/>
+      <w:r>
+        <w:rPr>
+          <w:rFonts w:ascii="Calibri" w:hAnsi="Calibri" w:cs="Calibri"/>
+          <w:sz w:val="22"/>
+          <w:szCs w:val="22"/>
+        </w:rPr>
+        <w:t>productID</w:t>
+      </w:r>
+      <w:proofErr w:type="spellEnd"/>
+      <w:r>
+        <w:rPr>
+          <w:rFonts w:ascii="Calibri" w:hAnsi="Calibri" w:cs="Calibri"/>
+          <w:sz w:val="22"/>
+          <w:szCs w:val="22"/>
+        </w:rPr>
+        <w:t xml:space="preserve"> the identifier of the product.</w:t>
+      </w:r>
+    </w:p>
+    <w:p>
+      <w:pPr>
+        <w:spacing w:after="0"/>
+        <w:rPr>
+          <w:rFonts w:ascii="Calibri" w:hAnsi="Calibri" w:cs="Calibri"/>
+          <w:sz w:val="22"/>
+          <w:szCs w:val="22"/>
+        </w:rPr>
+      </w:pPr>
+      <w:r>
+        <w:rPr>
+          <w:rFonts w:ascii="Calibri" w:hAnsi="Calibri" w:cs="Calibri"/>
+          <w:sz w:val="22"/>
+          <w:szCs w:val="22"/>
+        </w:rPr>
+        <w:t xml:space="preserve"> * Constraint: must refer to an existing product.</w:t>
+      </w:r>
+    </w:p>
+    <w:p>
+      <w:pPr>
+        <w:spacing w:after="0"/>
+        <w:rPr>
+          <w:rFonts w:ascii="Calibri" w:hAnsi="Calibri" w:cs="Calibri"/>
+          <w:sz w:val="22"/>
+          <w:szCs w:val="22"/>
+        </w:rPr>
+      </w:pPr>
+      <w:r>
+        <w:rPr>
+          <w:rFonts w:ascii="Calibri" w:hAnsi="Calibri" w:cs="Calibri"/>
+          <w:sz w:val="22"/>
+          <w:szCs w:val="22"/>
+        </w:rPr>
+        <w:t xml:space="preserve"> * @param amount the change in stock quantity.</w:t>
+      </w:r>
+    </w:p>
+    <w:p>
+      <w:pPr>
+        <w:spacing w:after="0"/>
+        <w:rPr>
+          <w:rFonts w:ascii="Calibri" w:hAnsi="Calibri" w:cs="Calibri"/>
+          <w:sz w:val="22"/>
+          <w:szCs w:val="22"/>
+        </w:rPr>
+      </w:pPr>
+      <w:r>
+        <w:rPr>
+          <w:rFonts w:ascii="Calibri" w:hAnsi="Calibri" w:cs="Calibri"/>
+          <w:sz w:val="22"/>
+          <w:szCs w:val="22"/>
+        </w:rPr>
+        <w:t xml:space="preserve"> * Constraint: resulting stock must not fall below zero.</w:t>
+      </w:r>
+    </w:p>
+    <w:p>
+      <w:pPr>
+        <w:spacing w:after="0"/>
+        <w:rPr>
+          <w:rFonts w:ascii="Calibri" w:hAnsi="Calibri" w:cs="Calibri"/>
+          <w:sz w:val="22"/>
+          <w:szCs w:val="22"/>
+        </w:rPr>
+      </w:pPr>
+      <w:r>
+        <w:rPr>
+          <w:rFonts w:ascii="Calibri" w:hAnsi="Calibri" w:cs="Calibri"/>
+          <w:sz w:val="22"/>
+          <w:szCs w:val="22"/>
+        </w:rPr>
+        <w:t xml:space="preserve"> */</w:t>
+      </w:r>
+    </w:p>
+    <w:p>
+      <w:pPr>
+        <w:spacing w:after="0"/>
+        <w:rPr>
+          <w:rFonts w:ascii="Calibri" w:hAnsi="Calibri" w:cs="Calibri"/>
+          <w:sz w:val="22"/>
+          <w:szCs w:val="22"/>
+        </w:rPr>
+      </w:pPr>
+      <w:r>
+        <w:rPr>
+          <w:rFonts w:ascii="Calibri" w:hAnsi="Calibri" w:cs="Calibri"/>
+          <w:sz w:val="22"/>
+          <w:szCs w:val="22"/>
+        </w:rPr>
+        <w:t xml:space="preserve">public void </w:t>
+      </w:r>
+      <w:proofErr w:type="spellStart"/>
+      <w:proofErr w:type="gramStart"/>
+      <w:r>
+        <w:rPr>
+          <w:rFonts w:ascii="Calibri" w:hAnsi="Calibri" w:cs="Calibri"/>
+          <w:sz w:val="22"/>
+          <w:szCs w:val="22"/>
+        </w:rPr>
+        <w:t>mutateStock</w:t>
+      </w:r>
+      <w:proofErr w:type="spellEnd"/>
+      <w:r>
+        <w:rPr>
+          <w:rFonts w:ascii="Calibri" w:hAnsi="Calibri" w:cs="Calibri"/>
+          <w:sz w:val="22"/>
+          <w:szCs w:val="22"/>
+        </w:rPr>
+        <w:t>(</w:t>
+      </w:r>
+      <w:proofErr w:type="gramEnd"/>
+      <w:r>
+        <w:rPr>
+          <w:rFonts w:ascii="Calibri" w:hAnsi="Calibri" w:cs="Calibri"/>
+          <w:sz w:val="22"/>
+          <w:szCs w:val="22"/>
+        </w:rPr>
+        <w:t xml:space="preserve">int </w:t>
+      </w:r>
+      <w:proofErr w:type="spellStart"/>
+      <w:r>
+        <w:rPr>
+          <w:rFonts w:ascii="Calibri" w:hAnsi="Calibri" w:cs="Calibri"/>
+          <w:sz w:val="22"/>
+          <w:szCs w:val="22"/>
+        </w:rPr>
+        <w:t>productID</w:t>
+      </w:r>
+      <w:proofErr w:type="spellEnd"/>
+      <w:r>
+        <w:rPr>
+          <w:rFonts w:ascii="Calibri" w:hAnsi="Calibri" w:cs="Calibri"/>
+          <w:sz w:val="22"/>
+          <w:szCs w:val="22"/>
+        </w:rPr>
+        <w:t>, int amount</w:t>
+      </w:r>
+      <w:proofErr w:type="gramStart"/>
+      <w:r>
+        <w:rPr>
+          <w:rFonts w:ascii="Calibri" w:hAnsi="Calibri" w:cs="Calibri"/>
+          <w:sz w:val="22"/>
+          <w:szCs w:val="22"/>
+        </w:rPr>
+        <w:t>);</w:t>
+      </w:r>
+      <w:proofErr w:type="gramEnd"/>
+    </w:p>
+    <w:p>
+      <w:pPr>
+        <w:spacing w:after="0"/>
+        <w:rPr>
+          <w:rFonts w:ascii="Calibri" w:hAnsi="Calibri" w:cs="Calibri"/>
+          <w:sz w:val="22"/>
+          <w:szCs w:val="22"/>
+        </w:rPr>
+      </w:pPr>
+    </w:p>
+    <w:p>
+      <w:pPr>
+        <w:spacing w:after="0"/>
+        <w:rPr>
+          <w:rFonts w:ascii="Calibri" w:hAnsi="Calibri" w:cs="Calibri"/>
+          <w:sz w:val="22"/>
+          <w:szCs w:val="22"/>
+        </w:rPr>
+      </w:pPr>
+      <w:r>
+        <w:rPr>
+          <w:rFonts w:ascii="Calibri" w:hAnsi="Calibri" w:cs="Calibri"/>
+          <w:sz w:val="22"/>
+          <w:szCs w:val="22"/>
+        </w:rPr>
+        <w:t>/**</w:t>
+      </w:r>
+    </w:p>
+    <w:p>
+      <w:pPr>
+        <w:spacing w:after="0"/>
+        <w:rPr>
+          <w:rFonts w:ascii="Calibri" w:hAnsi="Calibri" w:cs="Calibri"/>
+          <w:sz w:val="22"/>
+          <w:szCs w:val="22"/>
+        </w:rPr>
+      </w:pPr>
+      <w:r>
+        <w:rPr>
+          <w:rFonts w:ascii="Calibri" w:hAnsi="Calibri" w:cs="Calibri"/>
+          <w:sz w:val="22"/>
+          <w:szCs w:val="22"/>
+        </w:rPr>
+        <w:t xml:space="preserve"> * Retrieves the current stock quantity of a product.</w:t>
+      </w:r>
+    </w:p>
+    <w:p>
+      <w:pPr>
+        <w:spacing w:after="0"/>
+        <w:rPr>
+          <w:rFonts w:ascii="Calibri" w:hAnsi="Calibri" w:cs="Calibri"/>
+          <w:sz w:val="22"/>
+          <w:szCs w:val="22"/>
+        </w:rPr>
+      </w:pPr>
+      <w:r>
+        <w:rPr>
+          <w:rFonts w:ascii="Calibri" w:hAnsi="Calibri" w:cs="Calibri"/>
+          <w:sz w:val="22"/>
+          <w:szCs w:val="22"/>
+        </w:rPr>
+        <w:t xml:space="preserve"> *</w:t>
+      </w:r>
+    </w:p>
+    <w:p>
+      <w:pPr>
+        <w:spacing w:after="0"/>
+        <w:rPr>
+          <w:rFonts w:ascii="Calibri" w:hAnsi="Calibri" w:cs="Calibri"/>
+          <w:sz w:val="22"/>
+          <w:szCs w:val="22"/>
+        </w:rPr>
+      </w:pPr>
+      <w:r>
+        <w:rPr>
+          <w:rFonts w:ascii="Calibri" w:hAnsi="Calibri" w:cs="Calibri"/>
+          <w:sz w:val="22"/>
+          <w:szCs w:val="22"/>
+        </w:rPr>
+        <w:t xml:space="preserve"> * @param </w:t>
+      </w:r>
+      <w:proofErr w:type="spellStart"/>
+      <w:r>
+        <w:rPr>
+          <w:rFonts w:ascii="Calibri" w:hAnsi="Calibri" w:cs="Calibri"/>
+          <w:sz w:val="22"/>
+          <w:szCs w:val="22"/>
+        </w:rPr>
+        <w:t>productID</w:t>
+      </w:r>
+      <w:proofErr w:type="spellEnd"/>
+      <w:r>
+        <w:rPr>
+          <w:rFonts w:ascii="Calibri" w:hAnsi="Calibri" w:cs="Calibri"/>
+          <w:sz w:val="22"/>
+          <w:szCs w:val="22"/>
+        </w:rPr>
+        <w:t xml:space="preserve"> the identifier of the product.</w:t>
+      </w:r>
+    </w:p>
+    <w:p>
+      <w:pPr>
+        <w:spacing w:after="0"/>
+        <w:rPr>
+          <w:rFonts w:ascii="Calibri" w:hAnsi="Calibri" w:cs="Calibri"/>
+          <w:sz w:val="22"/>
+          <w:szCs w:val="22"/>
+        </w:rPr>
+      </w:pPr>
+      <w:r>
+        <w:rPr>
+          <w:rFonts w:ascii="Calibri" w:hAnsi="Calibri" w:cs="Calibri"/>
+          <w:sz w:val="22"/>
+          <w:szCs w:val="22"/>
+        </w:rPr>
+        <w:t xml:space="preserve"> * Constraint: must refer to an existing product.</w:t>
+      </w:r>
+    </w:p>
+    <w:p>
+      <w:pPr>
+        <w:spacing w:after="0"/>
+        <w:rPr>
+          <w:rFonts w:ascii="Calibri" w:hAnsi="Calibri" w:cs="Calibri"/>
+          <w:sz w:val="22"/>
+          <w:szCs w:val="22"/>
+        </w:rPr>
+      </w:pPr>
+      <w:r>
+        <w:rPr>
+          <w:rFonts w:ascii="Calibri" w:hAnsi="Calibri" w:cs="Calibri"/>
+          <w:sz w:val="22"/>
+          <w:szCs w:val="22"/>
+        </w:rPr>
+        <w:t xml:space="preserve"> */</w:t>
+      </w:r>
+    </w:p>
+    <w:p>
+      <w:pPr>
+        <w:spacing w:after="0"/>
+        <w:rPr>
+          <w:rFonts w:ascii="Calibri" w:hAnsi="Calibri" w:cs="Calibri"/>
+          <w:sz w:val="22"/>
+          <w:szCs w:val="22"/>
+        </w:rPr>
+      </w:pPr>
+      <w:r>
+        <w:rPr>
+          <w:rFonts w:ascii="Calibri" w:hAnsi="Calibri" w:cs="Calibri"/>
+          <w:sz w:val="22"/>
+          <w:szCs w:val="22"/>
+        </w:rPr>
+        <w:t xml:space="preserve">public int </w:t>
+      </w:r>
+      <w:proofErr w:type="spellStart"/>
+      <w:proofErr w:type="gramStart"/>
+      <w:r>
+        <w:rPr>
+          <w:rFonts w:ascii="Calibri" w:hAnsi="Calibri" w:cs="Calibri"/>
+          <w:sz w:val="22"/>
+          <w:szCs w:val="22"/>
+        </w:rPr>
+        <w:t>stockQuantity</w:t>
+      </w:r>
+      <w:proofErr w:type="spellEnd"/>
+      <w:r>
+        <w:rPr>
+          <w:rFonts w:ascii="Calibri" w:hAnsi="Calibri" w:cs="Calibri"/>
+          <w:sz w:val="22"/>
+          <w:szCs w:val="22"/>
+        </w:rPr>
+        <w:t>(</w:t>
+      </w:r>
+      <w:proofErr w:type="gramEnd"/>
+      <w:r>
+        <w:rPr>
+          <w:rFonts w:ascii="Calibri" w:hAnsi="Calibri" w:cs="Calibri"/>
+          <w:sz w:val="22"/>
+          <w:szCs w:val="22"/>
+        </w:rPr>
+        <w:t xml:space="preserve">int </w:t>
+      </w:r>
+      <w:proofErr w:type="spellStart"/>
+      <w:r>
+        <w:rPr>
+          <w:rFonts w:ascii="Calibri" w:hAnsi="Calibri" w:cs="Calibri"/>
+          <w:sz w:val="22"/>
+          <w:szCs w:val="22"/>
+        </w:rPr>
+        <w:t>productID</w:t>
+      </w:r>
+      <w:proofErr w:type="spellEnd"/>
+      <w:proofErr w:type="gramStart"/>
+      <w:r>
+        <w:rPr>
+          <w:rFonts w:ascii="Calibri" w:hAnsi="Calibri" w:cs="Calibri"/>
+          <w:sz w:val="22"/>
+          <w:szCs w:val="22"/>
+        </w:rPr>
+        <w:t>);</w:t>
+      </w:r>
+      <w:proofErr w:type="gramEnd"/>
     </w:p>
     <w:p>
       <w:pPr>

</xml_diff>